<commit_message>
module 6 complete; working on modukes 7 and 8
</commit_message>
<xml_diff>
--- a/Module_6/M06B Textbook Assignment.docx
+++ b/Module_6/M06B Textbook Assignment.docx
@@ -43,11 +43,28 @@
         <w:t xml:space="preserve">Module6.exe application that is a compiled version of the Main program, and a Build_and_Run.bat script that </w:t>
       </w:r>
       <w:r>
-        <w:t xml:space="preserve">compiles all of the code files and runs the program. I will attach all of these files </w:t>
-      </w:r>
-      <w:r>
-        <w:t>in addition to inserting the code for each file below.</w:t>
-      </w:r>
+        <w:t xml:space="preserve">compiles all of the code files and runs the program. </w:t>
+      </w:r>
+      <w:r>
+        <w:t>I</w:t>
+      </w:r>
+      <w:r>
+        <w:t>n addition to inserting the code for each file below</w:t>
+      </w:r>
+      <w:r>
+        <w:t xml:space="preserve">, I have shared my project folder through OneDrive. </w:t>
+      </w:r>
+      <w:r>
+        <w:t xml:space="preserve">It is accessible at this link so that the actual files can be downloaded for easier access: </w:t>
+      </w:r>
+      <w:hyperlink r:id="rId7" w:history="1">
+        <w:r>
+          <w:rPr>
+            <w:rStyle w:val="Hyperlink"/>
+          </w:rPr>
+          <w:t>Module_6</w:t>
+        </w:r>
+      </w:hyperlink>
     </w:p>
     <w:p>
       <w:pPr>
@@ -82,7 +99,7 @@
       </w:r>
     </w:p>
     <w:p>
-      <w:hyperlink r:id="rId7" w:history="1">
+      <w:hyperlink r:id="rId8" w:history="1">
         <w:r>
           <w:rPr>
             <w:rStyle w:val="Hyperlink"/>
@@ -92,7 +109,7 @@
       </w:hyperlink>
     </w:p>
     <w:p>
-      <w:hyperlink r:id="rId8" w:history="1">
+      <w:hyperlink r:id="rId9" w:history="1">
         <w:r>
           <w:rPr>
             <w:rStyle w:val="Hyperlink"/>
@@ -102,7 +119,7 @@
       </w:hyperlink>
     </w:p>
     <w:p>
-      <w:hyperlink r:id="rId9" w:history="1">
+      <w:hyperlink r:id="rId10" w:history="1">
         <w:r>
           <w:rPr>
             <w:rStyle w:val="Hyperlink"/>
@@ -112,7 +129,7 @@
       </w:hyperlink>
     </w:p>
     <w:p>
-      <w:hyperlink r:id="rId10" w:history="1">
+      <w:hyperlink r:id="rId11" w:history="1">
         <w:r>
           <w:rPr>
             <w:rStyle w:val="Hyperlink"/>
@@ -122,7 +139,7 @@
       </w:hyperlink>
     </w:p>
     <w:p>
-      <w:hyperlink r:id="rId11" w:history="1">
+      <w:hyperlink r:id="rId12" w:history="1">
         <w:r>
           <w:rPr>
             <w:rStyle w:val="Hyperlink"/>
@@ -137,7 +154,15 @@
         <w:pStyle w:val="Heading1"/>
       </w:pPr>
       <w:r>
-        <w:t>Source Code of All files (.h, .</w:t>
+        <w:t xml:space="preserve">Source Code of All </w:t>
+      </w:r>
+      <w:proofErr w:type="gramStart"/>
+      <w:r>
+        <w:t>files (.</w:t>
+      </w:r>
+      <w:proofErr w:type="gramEnd"/>
+      <w:r>
+        <w:t>h, .</w:t>
       </w:r>
       <w:proofErr w:type="spellStart"/>
       <w:r>
@@ -391,6 +416,7 @@
           <w:szCs w:val="22"/>
         </w:rPr>
       </w:pPr>
+      <w:proofErr w:type="gramStart"/>
       <w:r>
         <w:rPr>
           <w:rFonts w:asciiTheme="minorHAnsi" w:eastAsiaTheme="minorHAnsi" w:hAnsiTheme="minorHAnsi" w:cstheme="minorBidi"/>
@@ -398,7 +424,17 @@
           <w:sz w:val="22"/>
           <w:szCs w:val="22"/>
         </w:rPr>
-        <w:t>@echo off</w:t>
+        <w:t>@echo</w:t>
+      </w:r>
+      <w:proofErr w:type="gramEnd"/>
+      <w:r>
+        <w:rPr>
+          <w:rFonts w:asciiTheme="minorHAnsi" w:eastAsiaTheme="minorHAnsi" w:hAnsiTheme="minorHAnsi" w:cstheme="minorBidi"/>
+          <w:color w:val="auto"/>
+          <w:sz w:val="22"/>
+          <w:szCs w:val="22"/>
+        </w:rPr>
+        <w:t xml:space="preserve"> off</w:t>
       </w:r>
     </w:p>
     <w:p>
@@ -721,16 +757,7 @@
           <w:sz w:val="22"/>
           <w:szCs w:val="22"/>
         </w:rPr>
-        <w:t>E</w:t>
-      </w:r>
-      <w:r>
-        <w:rPr>
-          <w:rFonts w:asciiTheme="minorHAnsi" w:eastAsiaTheme="minorHAnsi" w:hAnsiTheme="minorHAnsi" w:cstheme="minorBidi"/>
-          <w:color w:val="auto"/>
-          <w:sz w:val="22"/>
-          <w:szCs w:val="22"/>
-        </w:rPr>
-        <w:t>xit</w:t>
+        <w:t>Exit</w:t>
       </w:r>
       <w:r>
         <w:rPr>
@@ -795,7 +822,15 @@
     <w:p/>
     <w:p>
       <w:r>
-        <w:t>//!SECTION: The main function starts the server in a separate thread, waits for it to initialize, and then runs the client to interact with the server. The server will be running in an infinite loop to handle multiple client connections sequentially, while the client will allow the user to input state abbreviations and receive the corresponding long names from the server until the user decides to exit the program.</w:t>
+        <w:t>/</w:t>
+      </w:r>
+      <w:proofErr w:type="gramStart"/>
+      <w:r>
+        <w:t>/!SECTION</w:t>
+      </w:r>
+      <w:proofErr w:type="gramEnd"/>
+      <w:r>
+        <w:t>: The main function starts the server in a separate thread, waits for it to initialize, and then runs the client to interact with the server. The server will be running in an infinite loop to handle multiple client connections sequentially, while the client will allow the user to input state abbreviations and receive the corresponding long names from the server until the user decides to exit the program.</w:t>
       </w:r>
     </w:p>
     <w:p/>
@@ -810,12 +845,35 @@
       </w:r>
     </w:p>
     <w:p>
+      <w:proofErr w:type="gramStart"/>
+      <w:r>
+        <w:t>#include</w:t>
+      </w:r>
+      <w:proofErr w:type="gramEnd"/>
+      <w:r>
+        <w:t xml:space="preserve"> "</w:t>
+      </w:r>
+      <w:proofErr w:type="spellStart"/>
+      <w:r>
+        <w:t>Server</w:t>
+      </w:r>
+      <w:proofErr w:type="gramStart"/>
+      <w:r>
+        <w:t>.h</w:t>
+      </w:r>
+      <w:proofErr w:type="spellEnd"/>
+      <w:proofErr w:type="gramEnd"/>
+      <w:r>
+        <w:t>"</w:t>
+      </w:r>
+    </w:p>
+    <w:p>
       <w:r>
         <w:t>#include "</w:t>
       </w:r>
       <w:proofErr w:type="spellStart"/>
       <w:r>
-        <w:t>Server.h</w:t>
+        <w:t>Client.h</w:t>
       </w:r>
       <w:proofErr w:type="spellEnd"/>
       <w:r>
@@ -823,21 +881,13 @@
       </w:r>
     </w:p>
     <w:p>
-      <w:r>
-        <w:t>#include "</w:t>
-      </w:r>
-      <w:proofErr w:type="spellStart"/>
-      <w:r>
-        <w:t>Client.h</w:t>
-      </w:r>
-      <w:proofErr w:type="spellEnd"/>
-      <w:r>
-        <w:t>"</w:t>
-      </w:r>
-    </w:p>
-    <w:p>
-      <w:r>
-        <w:t>#include &lt;iostream&gt;</w:t>
+      <w:proofErr w:type="gramStart"/>
+      <w:r>
+        <w:t>#include</w:t>
+      </w:r>
+      <w:proofErr w:type="gramEnd"/>
+      <w:r>
+        <w:t xml:space="preserve"> &lt;iostream&gt;</w:t>
       </w:r>
     </w:p>
     <w:p>
@@ -846,8 +896,13 @@
       </w:r>
     </w:p>
     <w:p>
-      <w:r>
-        <w:t>#include &lt;thread&gt;</w:t>
+      <w:proofErr w:type="gramStart"/>
+      <w:r>
+        <w:t>#include</w:t>
+      </w:r>
+      <w:proofErr w:type="gramEnd"/>
+      <w:r>
+        <w:t xml:space="preserve"> &lt;thread&gt;</w:t>
       </w:r>
     </w:p>
     <w:p>
@@ -858,8 +913,13 @@
     <w:p>
       <w:r>
         <w:lastRenderedPageBreak/>
-        <w:t>using namespace std;</w:t>
-      </w:r>
+        <w:t xml:space="preserve">using namespace </w:t>
+      </w:r>
+      <w:proofErr w:type="gramStart"/>
+      <w:r>
+        <w:t>std;</w:t>
+      </w:r>
+      <w:proofErr w:type="gramEnd"/>
     </w:p>
     <w:p/>
     <w:p>
@@ -877,7 +937,15 @@
     </w:p>
     <w:p>
       <w:r>
-        <w:t>// single-file build task. This consolidates all code into one place.</w:t>
+        <w:t xml:space="preserve">// </w:t>
+      </w:r>
+      <w:proofErr w:type="gramStart"/>
+      <w:r>
+        <w:t>single-file</w:t>
+      </w:r>
+      <w:proofErr w:type="gramEnd"/>
+      <w:r>
+        <w:t xml:space="preserve"> build task. This consolidates all code into one place.</w:t>
       </w:r>
     </w:p>
     <w:p>
@@ -886,8 +954,13 @@
       </w:r>
     </w:p>
     <w:p>
-      <w:r>
-        <w:t>#include "Server.cpp"</w:t>
+      <w:proofErr w:type="gramStart"/>
+      <w:r>
+        <w:t>#include</w:t>
+      </w:r>
+      <w:proofErr w:type="gramEnd"/>
+      <w:r>
+        <w:t xml:space="preserve"> "Server.cpp"</w:t>
       </w:r>
     </w:p>
     <w:p/>
@@ -903,7 +976,15 @@
     </w:p>
     <w:p>
       <w:r>
-        <w:t>int main() {</w:t>
+        <w:t xml:space="preserve">int </w:t>
+      </w:r>
+      <w:proofErr w:type="gramStart"/>
+      <w:r>
+        <w:t>main(</w:t>
+      </w:r>
+      <w:proofErr w:type="gramEnd"/>
+      <w:r>
+        <w:t>) {</w:t>
       </w:r>
     </w:p>
     <w:p/>
@@ -914,26 +995,65 @@
     </w:p>
     <w:p>
       <w:r>
-        <w:t>    // The server is started in a separate thread to allow the main thread to run the client concurrently. The Server object is created with a specified port number (e.g., 8080), and the start method is called in a new thread to run the server. This allows the server to listen for incoming connections while the client is running in the main thread.</w:t>
-      </w:r>
-    </w:p>
-    <w:p>
-      <w:r>
-        <w:t>    Server server(8080);</w:t>
-      </w:r>
+        <w:t xml:space="preserve">    // The server is started in a separate thread to allow the main thread to run the client concurrently. The Server object is created with a specified port number (e.g., 8080), and the start method is called in a new thread to run the server. This allows the server to listen </w:t>
+      </w:r>
+      <w:proofErr w:type="gramStart"/>
+      <w:r>
+        <w:t>for</w:t>
+      </w:r>
+      <w:proofErr w:type="gramEnd"/>
+      <w:r>
+        <w:t xml:space="preserve"> incoming connections while the client is running in the main thread.</w:t>
+      </w:r>
+    </w:p>
+    <w:p>
+      <w:r>
+        <w:t xml:space="preserve">    Server </w:t>
+      </w:r>
+      <w:proofErr w:type="gramStart"/>
+      <w:r>
+        <w:t>server(</w:t>
+      </w:r>
+      <w:proofErr w:type="gramEnd"/>
+      <w:r>
+        <w:t>8080</w:t>
+      </w:r>
+      <w:proofErr w:type="gramStart"/>
+      <w:r>
+        <w:t>);</w:t>
+      </w:r>
+      <w:proofErr w:type="gramEnd"/>
     </w:p>
     <w:p>
       <w:r>
         <w:t xml:space="preserve">    thread </w:t>
       </w:r>
       <w:proofErr w:type="spellStart"/>
+      <w:proofErr w:type="gramStart"/>
       <w:r>
         <w:t>serverThread</w:t>
       </w:r>
       <w:proofErr w:type="spellEnd"/>
       <w:r>
-        <w:t>(&amp;Server::start, &amp;server);</w:t>
-      </w:r>
+        <w:t>(</w:t>
+      </w:r>
+      <w:proofErr w:type="gramEnd"/>
+      <w:r>
+        <w:t>&amp;</w:t>
+      </w:r>
+      <w:proofErr w:type="gramStart"/>
+      <w:r>
+        <w:t>Server::</w:t>
+      </w:r>
+      <w:proofErr w:type="gramEnd"/>
+      <w:r>
+        <w:t>start, &amp;server</w:t>
+      </w:r>
+      <w:proofErr w:type="gramStart"/>
+      <w:r>
+        <w:t>);</w:t>
+      </w:r>
+      <w:proofErr w:type="gramEnd"/>
     </w:p>
     <w:p/>
     <w:p>
@@ -960,20 +1080,38 @@
       </w:r>
       <w:proofErr w:type="spellStart"/>
       <w:r>
-        <w:t>this_thread</w:t>
+        <w:t>this_</w:t>
+      </w:r>
+      <w:proofErr w:type="gramStart"/>
+      <w:r>
+        <w:t>thread</w:t>
       </w:r>
       <w:proofErr w:type="spellEnd"/>
       <w:r>
         <w:t>::</w:t>
       </w:r>
       <w:proofErr w:type="spellStart"/>
-      <w:r>
-        <w:t>sleep_for</w:t>
-      </w:r>
-      <w:proofErr w:type="spellEnd"/>
-      <w:r>
-        <w:t>(chrono::seconds(1));</w:t>
-      </w:r>
+      <w:proofErr w:type="gramEnd"/>
+      <w:r>
+        <w:t>sleep_</w:t>
+      </w:r>
+      <w:proofErr w:type="gramStart"/>
+      <w:r>
+        <w:t>for</w:t>
+      </w:r>
+      <w:proofErr w:type="spellEnd"/>
+      <w:r>
+        <w:t>(chrono::seconds(</w:t>
+      </w:r>
+      <w:proofErr w:type="gramEnd"/>
+      <w:r>
+        <w:t>1)</w:t>
+      </w:r>
+      <w:proofErr w:type="gramStart"/>
+      <w:r>
+        <w:t>);</w:t>
+      </w:r>
+      <w:proofErr w:type="gramEnd"/>
     </w:p>
     <w:p/>
     <w:p>
@@ -992,14 +1130,28 @@
     </w:p>
     <w:p>
       <w:r>
-        <w:t>    Client client("127.0.0.1", 8080);</w:t>
-      </w:r>
+        <w:t xml:space="preserve">    Client </w:t>
+      </w:r>
+      <w:proofErr w:type="gramStart"/>
+      <w:r>
+        <w:t>client(</w:t>
+      </w:r>
+      <w:proofErr w:type="gramEnd"/>
+      <w:r>
+        <w:t>"127.0.0.1", 8080</w:t>
+      </w:r>
+      <w:proofErr w:type="gramStart"/>
+      <w:r>
+        <w:t>);</w:t>
+      </w:r>
+      <w:proofErr w:type="gramEnd"/>
     </w:p>
     <w:p>
       <w:r>
         <w:t xml:space="preserve">    </w:t>
       </w:r>
       <w:proofErr w:type="spellStart"/>
+      <w:proofErr w:type="gramStart"/>
       <w:r>
         <w:t>client.run</w:t>
       </w:r>
@@ -1007,6 +1159,7 @@
       <w:r>
         <w:t>();</w:t>
       </w:r>
+      <w:proofErr w:type="gramEnd"/>
     </w:p>
     <w:p/>
     <w:p>
@@ -1029,8 +1182,13 @@
       </w:r>
       <w:proofErr w:type="spellEnd"/>
       <w:r>
-        <w:t>();</w:t>
-      </w:r>
+        <w:t>(</w:t>
+      </w:r>
+      <w:proofErr w:type="gramStart"/>
+      <w:r>
+        <w:t>);</w:t>
+      </w:r>
+      <w:proofErr w:type="gramEnd"/>
     </w:p>
     <w:p/>
     <w:p>
@@ -1040,13 +1198,26 @@
     </w:p>
     <w:p>
       <w:r>
-        <w:t>    // The main function returns 0 to indicate that the program has ended successfully. This is a standard practice in C++ to indicate that the program has completed without errors. The server will continue to run in the background due to the detached thread, but the main thread will exit after the client finishes its execution.</w:t>
-      </w:r>
-    </w:p>
-    <w:p>
-      <w:r>
-        <w:t>    return 0;</w:t>
-      </w:r>
+        <w:t xml:space="preserve">    // The main function returns 0 to indicate that the program has ended successfully. This is a standard practice in C++ to indicate that the program has </w:t>
+      </w:r>
+      <w:proofErr w:type="gramStart"/>
+      <w:r>
+        <w:t>completed</w:t>
+      </w:r>
+      <w:proofErr w:type="gramEnd"/>
+      <w:r>
+        <w:t xml:space="preserve"> without errors. The server will continue to run in the background due to the detached thread, but the main thread will exit after the client finishes its execution.</w:t>
+      </w:r>
+    </w:p>
+    <w:p>
+      <w:r>
+        <w:t xml:space="preserve">    return </w:t>
+      </w:r>
+      <w:proofErr w:type="gramStart"/>
+      <w:r>
+        <w:t>0;</w:t>
+      </w:r>
+      <w:proofErr w:type="gramEnd"/>
     </w:p>
     <w:p>
       <w:r>
@@ -1140,7 +1311,15 @@
     <w:p/>
     <w:p>
       <w:r>
-        <w:t xml:space="preserve">//!SECTION: The Client class is defined and implemented in this </w:t>
+        <w:t>/</w:t>
+      </w:r>
+      <w:proofErr w:type="gramStart"/>
+      <w:r>
+        <w:t>/!SECTION</w:t>
+      </w:r>
+      <w:proofErr w:type="gramEnd"/>
+      <w:r>
+        <w:t xml:space="preserve">: The Client class is defined and implemented in this </w:t>
       </w:r>
       <w:proofErr w:type="spellStart"/>
       <w:r>
@@ -1176,36 +1355,66 @@
       </w:r>
     </w:p>
     <w:p>
-      <w:r>
-        <w:t>#include &lt;iostream&gt;</w:t>
-      </w:r>
-    </w:p>
-    <w:p>
-      <w:r>
-        <w:t>#include &lt;winsock2.h&gt;</w:t>
-      </w:r>
-    </w:p>
-    <w:p>
-      <w:r>
-        <w:t>#include &lt;</w:t>
-      </w:r>
-      <w:proofErr w:type="spellStart"/>
-      <w:r>
-        <w:t>windows.h</w:t>
-      </w:r>
-      <w:proofErr w:type="spellEnd"/>
+      <w:proofErr w:type="gramStart"/>
+      <w:r>
+        <w:t>#include</w:t>
+      </w:r>
+      <w:proofErr w:type="gramEnd"/>
+      <w:r>
+        <w:t xml:space="preserve"> &lt;iostream&gt;</w:t>
+      </w:r>
+    </w:p>
+    <w:p>
+      <w:proofErr w:type="gramStart"/>
+      <w:r>
+        <w:t>#include</w:t>
+      </w:r>
+      <w:proofErr w:type="gramEnd"/>
+      <w:r>
+        <w:t xml:space="preserve"> &lt;winsock2.h&gt;</w:t>
+      </w:r>
+    </w:p>
+    <w:p>
+      <w:proofErr w:type="gramStart"/>
+      <w:r>
+        <w:t>#include</w:t>
+      </w:r>
+      <w:proofErr w:type="gramEnd"/>
+      <w:r>
+        <w:t xml:space="preserve"> &lt;</w:t>
+      </w:r>
+      <w:proofErr w:type="spellStart"/>
+      <w:r>
+        <w:t>windows</w:t>
+      </w:r>
+      <w:proofErr w:type="gramStart"/>
+      <w:r>
+        <w:t>.h</w:t>
+      </w:r>
+      <w:proofErr w:type="spellEnd"/>
+      <w:proofErr w:type="gramEnd"/>
       <w:r>
         <w:t>&gt;</w:t>
       </w:r>
     </w:p>
     <w:p>
-      <w:r>
-        <w:t>#include &lt;ws2tcpip.h&gt;</w:t>
-      </w:r>
-    </w:p>
-    <w:p>
-      <w:r>
-        <w:t>#include &lt;</w:t>
+      <w:proofErr w:type="gramStart"/>
+      <w:r>
+        <w:t>#include</w:t>
+      </w:r>
+      <w:proofErr w:type="gramEnd"/>
+      <w:r>
+        <w:t xml:space="preserve"> &lt;ws2tcpip.h&gt;</w:t>
+      </w:r>
+    </w:p>
+    <w:p>
+      <w:proofErr w:type="gramStart"/>
+      <w:r>
+        <w:t>#include</w:t>
+      </w:r>
+      <w:proofErr w:type="gramEnd"/>
+      <w:r>
+        <w:t xml:space="preserve"> &lt;</w:t>
       </w:r>
       <w:proofErr w:type="spellStart"/>
       <w:r>
@@ -1217,8 +1426,13 @@
       </w:r>
     </w:p>
     <w:p>
-      <w:r>
-        <w:t>#include &lt;</w:t>
+      <w:proofErr w:type="gramStart"/>
+      <w:r>
+        <w:t>#include</w:t>
+      </w:r>
+      <w:proofErr w:type="gramEnd"/>
+      <w:r>
+        <w:t xml:space="preserve"> &lt;</w:t>
       </w:r>
       <w:proofErr w:type="spellStart"/>
       <w:r>
@@ -1235,8 +1449,13 @@
       </w:r>
     </w:p>
     <w:p>
-      <w:r>
-        <w:t>#include &lt;thread&gt;</w:t>
+      <w:proofErr w:type="gramStart"/>
+      <w:r>
+        <w:t>#include</w:t>
+      </w:r>
+      <w:proofErr w:type="gramEnd"/>
+      <w:r>
+        <w:t xml:space="preserve"> &lt;thread&gt;</w:t>
       </w:r>
     </w:p>
     <w:p>
@@ -1246,8 +1465,13 @@
     </w:p>
     <w:p>
       <w:r>
-        <w:t>using namespace std;</w:t>
-      </w:r>
+        <w:t xml:space="preserve">using namespace </w:t>
+      </w:r>
+      <w:proofErr w:type="gramStart"/>
+      <w:r>
+        <w:t>std;</w:t>
+      </w:r>
+      <w:proofErr w:type="gramEnd"/>
     </w:p>
     <w:p/>
     <w:p>
@@ -1269,8 +1493,21 @@
       </w:r>
     </w:p>
     <w:p>
-      <w:r>
-        <w:t xml:space="preserve">Client::Client(const std::string&amp; </w:t>
+      <w:proofErr w:type="gramStart"/>
+      <w:r>
+        <w:t>Client::Client(</w:t>
+      </w:r>
+      <w:proofErr w:type="gramEnd"/>
+      <w:r>
+        <w:t xml:space="preserve">const </w:t>
+      </w:r>
+      <w:proofErr w:type="gramStart"/>
+      <w:r>
+        <w:t>std::</w:t>
+      </w:r>
+      <w:proofErr w:type="gramEnd"/>
+      <w:r>
+        <w:t xml:space="preserve">string&amp; </w:t>
       </w:r>
       <w:proofErr w:type="spellStart"/>
       <w:r>
@@ -1278,7 +1515,15 @@
       </w:r>
       <w:proofErr w:type="spellEnd"/>
       <w:r>
-        <w:t xml:space="preserve">, int port) : </w:t>
+        <w:t>, int port</w:t>
+      </w:r>
+      <w:proofErr w:type="gramStart"/>
+      <w:r>
+        <w:t>) :</w:t>
+      </w:r>
+      <w:proofErr w:type="gramEnd"/>
+      <w:r>
+        <w:t xml:space="preserve"> </w:t>
       </w:r>
       <w:proofErr w:type="spellStart"/>
       <w:r>
@@ -1294,13 +1539,26 @@
       </w:r>
       <w:proofErr w:type="spellEnd"/>
       <w:r>
-        <w:t>), port(port) {}</w:t>
-      </w:r>
+        <w:t>), port(</w:t>
+      </w:r>
+      <w:proofErr w:type="gramStart"/>
+      <w:r>
+        <w:t>port) {}</w:t>
+      </w:r>
+      <w:proofErr w:type="gramEnd"/>
     </w:p>
     <w:p/>
     <w:p>
       <w:r>
-        <w:t>//SECTION - Definition of the run method for the Client class</w:t>
+        <w:t xml:space="preserve">//SECTION - Definition of the </w:t>
+      </w:r>
+      <w:proofErr w:type="gramStart"/>
+      <w:r>
+        <w:t>run</w:t>
+      </w:r>
+      <w:proofErr w:type="gramEnd"/>
+      <w:r>
+        <w:t xml:space="preserve"> method for the Client class</w:t>
       </w:r>
     </w:p>
     <w:p>
@@ -1311,7 +1569,15 @@
     </w:p>
     <w:p>
       <w:r>
-        <w:t>void Client::run() {</w:t>
+        <w:t xml:space="preserve">void </w:t>
+      </w:r>
+      <w:proofErr w:type="gramStart"/>
+      <w:r>
+        <w:t>Client::run(</w:t>
+      </w:r>
+      <w:proofErr w:type="gramEnd"/>
+      <w:r>
+        <w:t>) {</w:t>
       </w:r>
     </w:p>
     <w:p/>
@@ -1330,7 +1596,23 @@
       </w:r>
       <w:proofErr w:type="spellEnd"/>
       <w:r>
-        <w:t xml:space="preserve"> function is called to initialize the Winsock library. It takes a version number (in this case, MAKEWORD(2, 2) for Winsock version 2.2) and a pointer to a WSADATA structure that will receive details about the Windows Sockets implementation. If </w:t>
+        <w:t xml:space="preserve"> function is called to initialize the Winsock library. It takes </w:t>
+      </w:r>
+      <w:proofErr w:type="gramStart"/>
+      <w:r>
+        <w:t>a version</w:t>
+      </w:r>
+      <w:proofErr w:type="gramEnd"/>
+      <w:r>
+        <w:t xml:space="preserve"> number (in this case, </w:t>
+      </w:r>
+      <w:proofErr w:type="gramStart"/>
+      <w:r>
+        <w:t>MAKEWORD(</w:t>
+      </w:r>
+      <w:proofErr w:type="gramEnd"/>
+      <w:r>
+        <w:t xml:space="preserve">2, 2) for Winsock version 2.2) and a pointer to a WSADATA structure that will receive details about the Windows Sockets implementation. If </w:t>
       </w:r>
       <w:proofErr w:type="spellStart"/>
       <w:r>
@@ -1346,6 +1628,7 @@
         <w:t xml:space="preserve">    WSADATA </w:t>
       </w:r>
       <w:proofErr w:type="spellStart"/>
+      <w:proofErr w:type="gramStart"/>
       <w:r>
         <w:t>wsaData</w:t>
       </w:r>
@@ -1353,6 +1636,7 @@
       <w:r>
         <w:t>;</w:t>
       </w:r>
+      <w:proofErr w:type="gramEnd"/>
     </w:p>
     <w:p>
       <w:r>
@@ -1364,21 +1648,36 @@
         <w:t>    if (</w:t>
       </w:r>
       <w:proofErr w:type="spellStart"/>
+      <w:proofErr w:type="gramStart"/>
       <w:r>
         <w:t>WSAStartup</w:t>
       </w:r>
       <w:proofErr w:type="spellEnd"/>
       <w:r>
-        <w:t>(MAKEWORD(2, 2), &amp;</w:t>
+        <w:t>(MAKEWORD(</w:t>
+      </w:r>
+      <w:proofErr w:type="gramEnd"/>
+      <w:r>
+        <w:t>2, 2), &amp;</w:t>
       </w:r>
       <w:proofErr w:type="spellStart"/>
       <w:r>
         <w:t>wsaData</w:t>
       </w:r>
       <w:proofErr w:type="spellEnd"/>
-      <w:r>
-        <w:t>) != 0) {</w:t>
-      </w:r>
+      <w:proofErr w:type="gramStart"/>
+      <w:r>
+        <w:t>) !</w:t>
+      </w:r>
+      <w:proofErr w:type="gramEnd"/>
+      <w:r>
+        <w:t xml:space="preserve">= </w:t>
+      </w:r>
+      <w:proofErr w:type="gramStart"/>
+      <w:r>
+        <w:t>0) {</w:t>
+      </w:r>
+      <w:proofErr w:type="gramEnd"/>
     </w:p>
     <w:p>
       <w:r>
@@ -1401,6 +1700,7 @@
         <w:t xml:space="preserve"> failed" &lt;&lt; </w:t>
       </w:r>
       <w:proofErr w:type="spellStart"/>
+      <w:proofErr w:type="gramStart"/>
       <w:r>
         <w:t>endl</w:t>
       </w:r>
@@ -1408,11 +1708,17 @@
       <w:r>
         <w:t>;</w:t>
       </w:r>
-    </w:p>
-    <w:p>
-      <w:r>
-        <w:t>        return;</w:t>
-      </w:r>
+      <w:proofErr w:type="gramEnd"/>
+    </w:p>
+    <w:p>
+      <w:r>
+        <w:t xml:space="preserve">        </w:t>
+      </w:r>
+      <w:proofErr w:type="gramStart"/>
+      <w:r>
+        <w:t>return;</w:t>
+      </w:r>
+      <w:proofErr w:type="gramEnd"/>
     </w:p>
     <w:p>
       <w:r>
@@ -1448,8 +1754,13 @@
     </w:p>
     <w:p>
       <w:r>
-        <w:t>        string abbreviation;</w:t>
-      </w:r>
+        <w:t xml:space="preserve">        string </w:t>
+      </w:r>
+      <w:proofErr w:type="gramStart"/>
+      <w:r>
+        <w:t>abbreviation;</w:t>
+      </w:r>
+      <w:proofErr w:type="gramEnd"/>
     </w:p>
     <w:p>
       <w:r>
@@ -1467,8 +1778,13 @@
       </w:r>
       <w:proofErr w:type="spellEnd"/>
       <w:r>
-        <w:t xml:space="preserve"> &lt;&lt; "Enter a state abbreviation (or type 'exit' to quit): ";</w:t>
-      </w:r>
+        <w:t xml:space="preserve"> &lt;&lt; "Enter a state abbreviation (or type 'exit' to quit): </w:t>
+      </w:r>
+      <w:proofErr w:type="gramStart"/>
+      <w:r>
+        <w:t>";</w:t>
+      </w:r>
+      <w:proofErr w:type="gramEnd"/>
     </w:p>
     <w:p>
       <w:r>
@@ -1485,8 +1801,13 @@
       </w:r>
       <w:proofErr w:type="spellEnd"/>
       <w:r>
-        <w:t xml:space="preserve"> &gt;&gt; abbreviation;</w:t>
-      </w:r>
+        <w:t xml:space="preserve"> &gt;&gt; </w:t>
+      </w:r>
+      <w:proofErr w:type="gramStart"/>
+      <w:r>
+        <w:t>abbreviation;</w:t>
+      </w:r>
+      <w:proofErr w:type="gramEnd"/>
     </w:p>
     <w:p/>
     <w:p>
@@ -1514,12 +1835,25 @@
     </w:p>
     <w:p>
       <w:r>
-        <w:t>        if (abbreviation == "exit") {</w:t>
-      </w:r>
-    </w:p>
-    <w:p>
-      <w:r>
-        <w:t>            // Print a message indicating that the program is exiting and start a countdown before ending the program</w:t>
+        <w:t>        if (abbreviation == "exit</w:t>
+      </w:r>
+      <w:proofErr w:type="gramStart"/>
+      <w:r>
+        <w:t>") {</w:t>
+      </w:r>
+      <w:proofErr w:type="gramEnd"/>
+    </w:p>
+    <w:p>
+      <w:r>
+        <w:t xml:space="preserve">            // Print a message indicating that the program is </w:t>
+      </w:r>
+      <w:proofErr w:type="gramStart"/>
+      <w:r>
+        <w:t>exiting</w:t>
+      </w:r>
+      <w:proofErr w:type="gramEnd"/>
+      <w:r>
+        <w:t xml:space="preserve"> and start a countdown before ending the program</w:t>
       </w:r>
     </w:p>
     <w:p>
@@ -1535,6 +1869,7 @@
         <w:t xml:space="preserve"> &lt;&lt; "Now exiting program." &lt;&lt; </w:t>
       </w:r>
       <w:proofErr w:type="spellStart"/>
+      <w:proofErr w:type="gramStart"/>
       <w:r>
         <w:t>endl</w:t>
       </w:r>
@@ -1542,6 +1877,7 @@
       <w:r>
         <w:t>;</w:t>
       </w:r>
+      <w:proofErr w:type="gramEnd"/>
     </w:p>
     <w:p>
       <w:r>
@@ -1569,6 +1905,7 @@
         <w:t xml:space="preserve"> &gt; 0; --</w:t>
       </w:r>
       <w:proofErr w:type="spellStart"/>
+      <w:proofErr w:type="gramStart"/>
       <w:r>
         <w:t>i</w:t>
       </w:r>
@@ -1576,6 +1913,7 @@
       <w:r>
         <w:t>) {</w:t>
       </w:r>
+      <w:proofErr w:type="gramEnd"/>
     </w:p>
     <w:p>
       <w:r>
@@ -1598,6 +1936,7 @@
         <w:t xml:space="preserve"> &lt;&lt; "..." &lt;&lt; </w:t>
       </w:r>
       <w:proofErr w:type="spellStart"/>
+      <w:proofErr w:type="gramStart"/>
       <w:r>
         <w:t>endl</w:t>
       </w:r>
@@ -1605,6 +1944,7 @@
       <w:r>
         <w:t>;</w:t>
       </w:r>
+      <w:proofErr w:type="gramEnd"/>
     </w:p>
     <w:p>
       <w:r>
@@ -1617,20 +1957,38 @@
       </w:r>
       <w:proofErr w:type="spellStart"/>
       <w:r>
-        <w:t>this_thread</w:t>
+        <w:t>this_</w:t>
+      </w:r>
+      <w:proofErr w:type="gramStart"/>
+      <w:r>
+        <w:t>thread</w:t>
       </w:r>
       <w:proofErr w:type="spellEnd"/>
       <w:r>
         <w:t>::</w:t>
       </w:r>
       <w:proofErr w:type="spellStart"/>
-      <w:r>
-        <w:t>sleep_for</w:t>
-      </w:r>
-      <w:proofErr w:type="spellEnd"/>
-      <w:r>
-        <w:t>(chrono::seconds(1));</w:t>
-      </w:r>
+      <w:proofErr w:type="gramEnd"/>
+      <w:r>
+        <w:t>sleep_</w:t>
+      </w:r>
+      <w:proofErr w:type="gramStart"/>
+      <w:r>
+        <w:t>for</w:t>
+      </w:r>
+      <w:proofErr w:type="spellEnd"/>
+      <w:r>
+        <w:t>(chrono::seconds(</w:t>
+      </w:r>
+      <w:proofErr w:type="gramEnd"/>
+      <w:r>
+        <w:t>1)</w:t>
+      </w:r>
+      <w:proofErr w:type="gramStart"/>
+      <w:r>
+        <w:t>);</w:t>
+      </w:r>
+      <w:proofErr w:type="gramEnd"/>
     </w:p>
     <w:p>
       <w:r>
@@ -1655,6 +2013,7 @@
         <w:t xml:space="preserve"> &lt;&lt; "Program ended." &lt;&lt; </w:t>
       </w:r>
       <w:proofErr w:type="spellStart"/>
+      <w:proofErr w:type="gramStart"/>
       <w:r>
         <w:t>endl</w:t>
       </w:r>
@@ -1662,11 +2021,17 @@
       <w:r>
         <w:t>;</w:t>
       </w:r>
-    </w:p>
-    <w:p>
-      <w:r>
-        <w:t>            break;</w:t>
-      </w:r>
+      <w:proofErr w:type="gramEnd"/>
+    </w:p>
+    <w:p>
+      <w:r>
+        <w:t xml:space="preserve">            </w:t>
+      </w:r>
+      <w:proofErr w:type="gramStart"/>
+      <w:r>
+        <w:t>break;</w:t>
+      </w:r>
+      <w:proofErr w:type="gramEnd"/>
     </w:p>
     <w:p>
       <w:r>
@@ -1690,8 +2055,21 @@
     </w:p>
     <w:p>
       <w:r>
-        <w:t>        SOCKET sock = socket(AF_INET, SOCK_STREAM, 0);</w:t>
-      </w:r>
+        <w:t xml:space="preserve">        SOCKET sock = </w:t>
+      </w:r>
+      <w:proofErr w:type="gramStart"/>
+      <w:r>
+        <w:t>socket(</w:t>
+      </w:r>
+      <w:proofErr w:type="gramEnd"/>
+      <w:r>
+        <w:t>AF_INET, SOCK_STREAM, 0</w:t>
+      </w:r>
+      <w:proofErr w:type="gramStart"/>
+      <w:r>
+        <w:t>);</w:t>
+      </w:r>
+      <w:proofErr w:type="gramEnd"/>
     </w:p>
     <w:p>
       <w:r>
@@ -1700,8 +2078,13 @@
     </w:p>
     <w:p>
       <w:r>
-        <w:t>        if (sock == INVALID_SOCKET) {</w:t>
-      </w:r>
+        <w:t>        if (sock == INVALID_</w:t>
+      </w:r>
+      <w:proofErr w:type="gramStart"/>
+      <w:r>
+        <w:t>SOCKET) {</w:t>
+      </w:r>
+      <w:proofErr w:type="gramEnd"/>
     </w:p>
     <w:p>
       <w:r>
@@ -1716,6 +2099,7 @@
         <w:t xml:space="preserve"> &lt;&lt; "Failed to create socket" &lt;&lt; </w:t>
       </w:r>
       <w:proofErr w:type="spellStart"/>
+      <w:proofErr w:type="gramStart"/>
       <w:r>
         <w:t>endl</w:t>
       </w:r>
@@ -1723,11 +2107,17 @@
       <w:r>
         <w:t>;</w:t>
       </w:r>
-    </w:p>
-    <w:p>
-      <w:r>
-        <w:t>            break;</w:t>
-      </w:r>
+      <w:proofErr w:type="gramEnd"/>
+    </w:p>
+    <w:p>
+      <w:r>
+        <w:t xml:space="preserve">            </w:t>
+      </w:r>
+      <w:proofErr w:type="gramStart"/>
+      <w:r>
+        <w:t>break;</w:t>
+      </w:r>
+      <w:proofErr w:type="gramEnd"/>
     </w:p>
     <w:p>
       <w:r>
@@ -1798,6 +2188,7 @@
         <w:t xml:space="preserve"> </w:t>
       </w:r>
       <w:proofErr w:type="spellStart"/>
+      <w:proofErr w:type="gramStart"/>
       <w:r>
         <w:t>serverAddress</w:t>
       </w:r>
@@ -1805,6 +2196,7 @@
       <w:r>
         <w:t>;</w:t>
       </w:r>
+      <w:proofErr w:type="gramEnd"/>
     </w:p>
     <w:p>
       <w:r>
@@ -1816,8 +2208,13 @@
       </w:r>
       <w:proofErr w:type="spellEnd"/>
       <w:r>
-        <w:t xml:space="preserve"> = AF_INET;</w:t>
-      </w:r>
+        <w:t xml:space="preserve"> = AF_</w:t>
+      </w:r>
+      <w:proofErr w:type="gramStart"/>
+      <w:r>
+        <w:t>INET;</w:t>
+      </w:r>
+      <w:proofErr w:type="gramEnd"/>
     </w:p>
     <w:p>
       <w:r>
@@ -1837,8 +2234,13 @@
       </w:r>
       <w:proofErr w:type="spellEnd"/>
       <w:r>
-        <w:t>(port);</w:t>
-      </w:r>
+        <w:t>(port</w:t>
+      </w:r>
+      <w:proofErr w:type="gramStart"/>
+      <w:r>
+        <w:t>);</w:t>
+      </w:r>
+      <w:proofErr w:type="gramEnd"/>
     </w:p>
     <w:p>
       <w:r>
@@ -1846,28 +2248,46 @@
       </w:r>
       <w:proofErr w:type="spellStart"/>
       <w:r>
-        <w:t>inet_pton</w:t>
-      </w:r>
-      <w:proofErr w:type="spellEnd"/>
-      <w:r>
-        <w:t xml:space="preserve">(AF_INET, </w:t>
-      </w:r>
-      <w:proofErr w:type="spellStart"/>
-      <w:r>
-        <w:t>serverIp.c_str</w:t>
-      </w:r>
-      <w:proofErr w:type="spellEnd"/>
-      <w:r>
-        <w:t>(), &amp;</w:t>
+        <w:t>inet_</w:t>
+      </w:r>
+      <w:proofErr w:type="gramStart"/>
+      <w:r>
+        <w:t>pton</w:t>
+      </w:r>
+      <w:proofErr w:type="spellEnd"/>
+      <w:r>
+        <w:t>(</w:t>
+      </w:r>
+      <w:proofErr w:type="gramEnd"/>
+      <w:r>
+        <w:t xml:space="preserve">AF_INET, </w:t>
+      </w:r>
+      <w:proofErr w:type="spellStart"/>
+      <w:r>
+        <w:t>serverIp.c_</w:t>
+      </w:r>
+      <w:proofErr w:type="gramStart"/>
+      <w:r>
+        <w:t>str</w:t>
+      </w:r>
+      <w:proofErr w:type="spellEnd"/>
+      <w:r>
+        <w:t>(</w:t>
+      </w:r>
+      <w:proofErr w:type="gramEnd"/>
+      <w:r>
+        <w:t>), &amp;</w:t>
       </w:r>
       <w:proofErr w:type="spellStart"/>
       <w:r>
         <w:t>serverAddress.sin_addr</w:t>
       </w:r>
       <w:proofErr w:type="spellEnd"/>
+      <w:proofErr w:type="gramStart"/>
       <w:r>
         <w:t>);</w:t>
       </w:r>
+      <w:proofErr w:type="gramEnd"/>
     </w:p>
     <w:p/>
     <w:p>
@@ -1887,17 +2307,27 @@
     </w:p>
     <w:p>
       <w:r>
-        <w:t>        if (connect(sock, (</w:t>
+        <w:t>        if (</w:t>
+      </w:r>
+      <w:proofErr w:type="gramStart"/>
+      <w:r>
+        <w:t>connect(</w:t>
+      </w:r>
+      <w:proofErr w:type="gramEnd"/>
+      <w:r>
+        <w:t>sock, (</w:t>
       </w:r>
       <w:proofErr w:type="spellStart"/>
       <w:r>
         <w:t>sockaddr</w:t>
       </w:r>
       <w:proofErr w:type="spellEnd"/>
+      <w:proofErr w:type="gramStart"/>
       <w:r>
         <w:t>*)&amp;</w:t>
       </w:r>
       <w:proofErr w:type="spellStart"/>
+      <w:proofErr w:type="gramEnd"/>
       <w:r>
         <w:t>serverAddress</w:t>
       </w:r>
@@ -1935,6 +2365,7 @@
         <w:t xml:space="preserve"> &lt;&lt; "Failed to connect to server" &lt;&lt; </w:t>
       </w:r>
       <w:proofErr w:type="spellStart"/>
+      <w:proofErr w:type="gramStart"/>
       <w:r>
         <w:t>endl</w:t>
       </w:r>
@@ -1942,6 +2373,7 @@
       <w:r>
         <w:t>;</w:t>
       </w:r>
+      <w:proofErr w:type="gramEnd"/>
     </w:p>
     <w:p>
       <w:r>
@@ -1953,13 +2385,23 @@
       </w:r>
       <w:proofErr w:type="spellEnd"/>
       <w:r>
-        <w:t>(sock);</w:t>
-      </w:r>
-    </w:p>
-    <w:p>
-      <w:r>
-        <w:t>            continue;</w:t>
-      </w:r>
+        <w:t>(sock</w:t>
+      </w:r>
+      <w:proofErr w:type="gramStart"/>
+      <w:r>
+        <w:t>);</w:t>
+      </w:r>
+      <w:proofErr w:type="gramEnd"/>
+    </w:p>
+    <w:p>
+      <w:r>
+        <w:t xml:space="preserve">            </w:t>
+      </w:r>
+      <w:proofErr w:type="gramStart"/>
+      <w:r>
+        <w:t>continue;</w:t>
+      </w:r>
+      <w:proofErr w:type="gramEnd"/>
     </w:p>
     <w:p>
       <w:r>
@@ -1978,33 +2420,64 @@
       </w:r>
       <w:proofErr w:type="spellStart"/>
       <w:r>
-        <w:t>c_str</w:t>
-      </w:r>
-      <w:proofErr w:type="spellEnd"/>
-      <w:r>
-        <w:t>()) and its size is specified. If sending the data fails, an error message is printed, the socket is closed, and the loop continues, allowing the user to try again. If the data is sent successfully, the client proceeds to wait for a response from the server.</w:t>
-      </w:r>
-    </w:p>
-    <w:p>
-      <w:r>
-        <w:t xml:space="preserve">        send(sock, </w:t>
-      </w:r>
-      <w:proofErr w:type="spellStart"/>
-      <w:r>
-        <w:t>abbreviation.c_str</w:t>
-      </w:r>
-      <w:proofErr w:type="spellEnd"/>
-      <w:r>
-        <w:t xml:space="preserve">(), </w:t>
-      </w:r>
-      <w:proofErr w:type="spellStart"/>
+        <w:t>c_</w:t>
+      </w:r>
+      <w:proofErr w:type="gramStart"/>
+      <w:r>
+        <w:t>str</w:t>
+      </w:r>
+      <w:proofErr w:type="spellEnd"/>
+      <w:r>
+        <w:t>(</w:t>
+      </w:r>
+      <w:proofErr w:type="gramEnd"/>
+      <w:r>
+        <w:t>)) and its size is specified. If sending the data fails, an error message is printed, the socket is closed, and the loop continues, allowing the user to try again. If the data is sent successfully, the client proceeds to wait for a response from the server.</w:t>
+      </w:r>
+    </w:p>
+    <w:p>
+      <w:r>
+        <w:t xml:space="preserve">        </w:t>
+      </w:r>
+      <w:proofErr w:type="gramStart"/>
+      <w:r>
+        <w:t>send(</w:t>
+      </w:r>
+      <w:proofErr w:type="gramEnd"/>
+      <w:r>
+        <w:t xml:space="preserve">sock, </w:t>
+      </w:r>
+      <w:proofErr w:type="spellStart"/>
+      <w:r>
+        <w:t>abbreviation.c_</w:t>
+      </w:r>
+      <w:proofErr w:type="gramStart"/>
+      <w:r>
+        <w:t>str</w:t>
+      </w:r>
+      <w:proofErr w:type="spellEnd"/>
+      <w:r>
+        <w:t>(</w:t>
+      </w:r>
+      <w:proofErr w:type="gramEnd"/>
+      <w:r>
+        <w:t xml:space="preserve">), </w:t>
+      </w:r>
+      <w:proofErr w:type="spellStart"/>
+      <w:proofErr w:type="gramStart"/>
       <w:r>
         <w:t>abbreviation.size</w:t>
       </w:r>
       <w:proofErr w:type="spellEnd"/>
-      <w:r>
-        <w:t>(), 0);</w:t>
-      </w:r>
+      <w:proofErr w:type="gramEnd"/>
+      <w:r>
+        <w:t>(), 0</w:t>
+      </w:r>
+      <w:proofErr w:type="gramStart"/>
+      <w:r>
+        <w:t>);</w:t>
+      </w:r>
+      <w:proofErr w:type="gramEnd"/>
     </w:p>
     <w:p/>
     <w:p>
@@ -2022,13 +2495,34 @@
       </w:r>
       <w:proofErr w:type="spellEnd"/>
       <w:r>
-        <w:t xml:space="preserve"> function. The response is stored in a buffer, and the number of bytes received is checked. If data is received successfully, it is printed to the screen as the state name. If receiving the response fails, an error message is printed. After handling the response, the socket is closed, and the loop continues to prompt the user for input until they choose to exit.</w:t>
-      </w:r>
-    </w:p>
-    <w:p>
-      <w:r>
-        <w:t>        char buffer[1024] = {0};</w:t>
-      </w:r>
+        <w:t xml:space="preserve"> function. The response is stored in a buffer, and the number of bytes received is checked. If data is received successfully, it is printed to the screen as the state name. If receiving the response fails, an error message is printed. After handling the response, the socket is closed, and the loop continues to prompt the user </w:t>
+      </w:r>
+      <w:proofErr w:type="gramStart"/>
+      <w:r>
+        <w:t>for</w:t>
+      </w:r>
+      <w:proofErr w:type="gramEnd"/>
+      <w:r>
+        <w:t xml:space="preserve"> input until they choose to exit.</w:t>
+      </w:r>
+    </w:p>
+    <w:p>
+      <w:r>
+        <w:t xml:space="preserve">        char </w:t>
+      </w:r>
+      <w:proofErr w:type="gramStart"/>
+      <w:r>
+        <w:t>buffer[</w:t>
+      </w:r>
+      <w:proofErr w:type="gramEnd"/>
+      <w:r>
+        <w:t>1024] = {0</w:t>
+      </w:r>
+      <w:proofErr w:type="gramStart"/>
+      <w:r>
+        <w:t>};</w:t>
+      </w:r>
+      <w:proofErr w:type="gramEnd"/>
     </w:p>
     <w:p>
       <w:r>
@@ -2043,13 +2537,23 @@
         <w:t xml:space="preserve"> = </w:t>
       </w:r>
       <w:proofErr w:type="spellStart"/>
+      <w:proofErr w:type="gramStart"/>
       <w:r>
         <w:t>recv</w:t>
       </w:r>
       <w:proofErr w:type="spellEnd"/>
       <w:r>
-        <w:t>(sock, buffer, 1024, 0);</w:t>
-      </w:r>
+        <w:t>(</w:t>
+      </w:r>
+      <w:proofErr w:type="gramEnd"/>
+      <w:r>
+        <w:t>sock, buffer, 1024, 0</w:t>
+      </w:r>
+      <w:proofErr w:type="gramStart"/>
+      <w:r>
+        <w:t>);</w:t>
+      </w:r>
+      <w:proofErr w:type="gramEnd"/>
     </w:p>
     <w:p>
       <w:r>
@@ -2066,8 +2570,13 @@
       </w:r>
       <w:proofErr w:type="spellEnd"/>
       <w:r>
-        <w:t xml:space="preserve"> &gt; 0) {</w:t>
-      </w:r>
+        <w:t xml:space="preserve"> &gt; </w:t>
+      </w:r>
+      <w:proofErr w:type="gramStart"/>
+      <w:r>
+        <w:t>0) {</w:t>
+      </w:r>
+      <w:proofErr w:type="gramEnd"/>
     </w:p>
     <w:p>
       <w:r>
@@ -2079,7 +2588,15 @@
       </w:r>
       <w:proofErr w:type="spellEnd"/>
       <w:r>
-        <w:t xml:space="preserve"> &lt;&lt; "State name: " &lt;&lt; string(buffer, </w:t>
+        <w:t xml:space="preserve"> &lt;&lt; "State name: " &lt;&lt; </w:t>
+      </w:r>
+      <w:proofErr w:type="gramStart"/>
+      <w:r>
+        <w:t>string(</w:t>
+      </w:r>
+      <w:proofErr w:type="gramEnd"/>
+      <w:r>
+        <w:t xml:space="preserve">buffer, </w:t>
       </w:r>
       <w:proofErr w:type="spellStart"/>
       <w:r>
@@ -2090,6 +2607,7 @@
         <w:t xml:space="preserve">) &lt;&lt; </w:t>
       </w:r>
       <w:proofErr w:type="spellStart"/>
+      <w:proofErr w:type="gramStart"/>
       <w:r>
         <w:t>endl</w:t>
       </w:r>
@@ -2097,6 +2615,7 @@
       <w:r>
         <w:t>;</w:t>
       </w:r>
+      <w:proofErr w:type="gramEnd"/>
     </w:p>
     <w:p>
       <w:r>
@@ -2116,6 +2635,7 @@
         <w:t xml:space="preserve"> &lt;&lt; "Failed to receive response from server" &lt;&lt; </w:t>
       </w:r>
       <w:proofErr w:type="spellStart"/>
+      <w:proofErr w:type="gramStart"/>
       <w:r>
         <w:t>endl</w:t>
       </w:r>
@@ -2123,6 +2643,7 @@
       <w:r>
         <w:t>;</w:t>
       </w:r>
+      <w:proofErr w:type="gramEnd"/>
     </w:p>
     <w:p>
       <w:r>
@@ -2158,8 +2679,13 @@
       </w:r>
       <w:proofErr w:type="spellEnd"/>
       <w:r>
-        <w:t>(sock);</w:t>
-      </w:r>
+        <w:t>(sock</w:t>
+      </w:r>
+      <w:proofErr w:type="gramStart"/>
+      <w:r>
+        <w:t>);</w:t>
+      </w:r>
+      <w:proofErr w:type="gramEnd"/>
     </w:p>
     <w:p>
       <w:r>
@@ -2174,6 +2700,7 @@
         <w:t xml:space="preserve"> &lt;&lt; </w:t>
       </w:r>
       <w:proofErr w:type="spellStart"/>
+      <w:proofErr w:type="gramStart"/>
       <w:r>
         <w:t>endl</w:t>
       </w:r>
@@ -2181,6 +2708,7 @@
       <w:r>
         <w:t>;</w:t>
       </w:r>
+      <w:proofErr w:type="gramEnd"/>
     </w:p>
     <w:p>
       <w:r>
@@ -2220,6 +2748,7 @@
         <w:t xml:space="preserve">    </w:t>
       </w:r>
       <w:proofErr w:type="spellStart"/>
+      <w:proofErr w:type="gramStart"/>
       <w:r>
         <w:t>WSACleanup</w:t>
       </w:r>
@@ -2227,6 +2756,7 @@
       <w:r>
         <w:t>();</w:t>
       </w:r>
+      <w:proofErr w:type="gramEnd"/>
     </w:p>
     <w:p>
       <w:r>
@@ -2287,7 +2817,23 @@
     <w:p/>
     <w:p>
       <w:r>
-        <w:t xml:space="preserve">//!SECTION: The Client class is declared in this header file, which includes necessary libraries and also declares the constructor and the run method. The </w:t>
+        <w:t>/</w:t>
+      </w:r>
+      <w:proofErr w:type="gramStart"/>
+      <w:r>
+        <w:t>/!SECTION</w:t>
+      </w:r>
+      <w:proofErr w:type="gramEnd"/>
+      <w:r>
+        <w:t xml:space="preserve">: The Client class is declared in this header file, which includes necessary libraries and also declares the </w:t>
+      </w:r>
+      <w:proofErr w:type="gramStart"/>
+      <w:r>
+        <w:t>constructor</w:t>
+      </w:r>
+      <w:proofErr w:type="gramEnd"/>
+      <w:r>
+        <w:t xml:space="preserve"> and the run method. The </w:t>
       </w:r>
       <w:proofErr w:type="spellStart"/>
       <w:r>
@@ -2332,36 +2878,66 @@
       </w:r>
     </w:p>
     <w:p>
-      <w:r>
-        <w:t>#include &lt;iostream&gt;</w:t>
-      </w:r>
-    </w:p>
-    <w:p>
-      <w:r>
-        <w:t>#include &lt;winsock2.h&gt;</w:t>
-      </w:r>
-    </w:p>
-    <w:p>
-      <w:r>
-        <w:t>#include &lt;</w:t>
-      </w:r>
-      <w:proofErr w:type="spellStart"/>
-      <w:r>
-        <w:t>windows.h</w:t>
-      </w:r>
-      <w:proofErr w:type="spellEnd"/>
+      <w:proofErr w:type="gramStart"/>
+      <w:r>
+        <w:t>#include</w:t>
+      </w:r>
+      <w:proofErr w:type="gramEnd"/>
+      <w:r>
+        <w:t xml:space="preserve"> &lt;iostream&gt;</w:t>
+      </w:r>
+    </w:p>
+    <w:p>
+      <w:proofErr w:type="gramStart"/>
+      <w:r>
+        <w:t>#include</w:t>
+      </w:r>
+      <w:proofErr w:type="gramEnd"/>
+      <w:r>
+        <w:t xml:space="preserve"> &lt;winsock2.h&gt;</w:t>
+      </w:r>
+    </w:p>
+    <w:p>
+      <w:proofErr w:type="gramStart"/>
+      <w:r>
+        <w:t>#include</w:t>
+      </w:r>
+      <w:proofErr w:type="gramEnd"/>
+      <w:r>
+        <w:t xml:space="preserve"> &lt;</w:t>
+      </w:r>
+      <w:proofErr w:type="spellStart"/>
+      <w:r>
+        <w:t>windows</w:t>
+      </w:r>
+      <w:proofErr w:type="gramStart"/>
+      <w:r>
+        <w:t>.h</w:t>
+      </w:r>
+      <w:proofErr w:type="spellEnd"/>
+      <w:proofErr w:type="gramEnd"/>
       <w:r>
         <w:t>&gt;</w:t>
       </w:r>
     </w:p>
     <w:p>
-      <w:r>
-        <w:t>#include &lt;ws2tcpip.h&gt;</w:t>
-      </w:r>
-    </w:p>
-    <w:p>
-      <w:r>
-        <w:t>#include &lt;</w:t>
+      <w:proofErr w:type="gramStart"/>
+      <w:r>
+        <w:t>#include</w:t>
+      </w:r>
+      <w:proofErr w:type="gramEnd"/>
+      <w:r>
+        <w:t xml:space="preserve"> &lt;ws2tcpip.h&gt;</w:t>
+      </w:r>
+    </w:p>
+    <w:p>
+      <w:proofErr w:type="gramStart"/>
+      <w:r>
+        <w:t>#include</w:t>
+      </w:r>
+      <w:proofErr w:type="gramEnd"/>
+      <w:r>
+        <w:t xml:space="preserve"> &lt;</w:t>
       </w:r>
       <w:proofErr w:type="spellStart"/>
       <w:r>
@@ -2373,8 +2949,13 @@
       </w:r>
     </w:p>
     <w:p>
-      <w:r>
-        <w:t>#include &lt;</w:t>
+      <w:proofErr w:type="gramStart"/>
+      <w:r>
+        <w:t>#include</w:t>
+      </w:r>
+      <w:proofErr w:type="gramEnd"/>
+      <w:r>
+        <w:t xml:space="preserve"> &lt;</w:t>
       </w:r>
       <w:proofErr w:type="spellStart"/>
       <w:r>
@@ -2392,8 +2973,13 @@
     </w:p>
     <w:p>
       <w:r>
-        <w:t>using namespace std;</w:t>
-      </w:r>
+        <w:t xml:space="preserve">using namespace </w:t>
+      </w:r>
+      <w:proofErr w:type="gramStart"/>
+      <w:r>
+        <w:t>std;</w:t>
+      </w:r>
+      <w:proofErr w:type="gramEnd"/>
     </w:p>
     <w:p/>
     <w:p>
@@ -2443,7 +3029,15 @@
     </w:p>
     <w:p>
       <w:r>
-        <w:t xml:space="preserve">    Client(const string&amp; </w:t>
+        <w:t xml:space="preserve">    </w:t>
+      </w:r>
+      <w:proofErr w:type="gramStart"/>
+      <w:r>
+        <w:t>Client(</w:t>
+      </w:r>
+      <w:proofErr w:type="gramEnd"/>
+      <w:r>
+        <w:t xml:space="preserve">const string&amp; </w:t>
       </w:r>
       <w:proofErr w:type="spellStart"/>
       <w:r>
@@ -2451,8 +3045,13 @@
       </w:r>
       <w:proofErr w:type="spellEnd"/>
       <w:r>
-        <w:t>, int port);</w:t>
-      </w:r>
+        <w:t>, int port</w:t>
+      </w:r>
+      <w:proofErr w:type="gramStart"/>
+      <w:r>
+        <w:t>);</w:t>
+      </w:r>
+      <w:proofErr w:type="gramEnd"/>
     </w:p>
     <w:p/>
     <w:p>
@@ -2462,12 +3061,28 @@
     </w:p>
     <w:p>
       <w:r>
-        <w:t>    // The destructor is defined to perform any necessary cleanup when a Client object is destroyed. In this case, it is left empty as there are no specific resources that need to be released when the Client object is destroyed. However, it is good practice to define a destructor in case any future modifications to the Client class require cleanup of resources.</w:t>
-      </w:r>
-    </w:p>
-    <w:p>
-      <w:r>
-        <w:t>    ~Client() {}</w:t>
+        <w:t xml:space="preserve">    // The destructor is defined to perform any necessary cleanup when a </w:t>
+      </w:r>
+      <w:proofErr w:type="gramStart"/>
+      <w:r>
+        <w:t>Client</w:t>
+      </w:r>
+      <w:proofErr w:type="gramEnd"/>
+      <w:r>
+        <w:t xml:space="preserve"> object is destroyed. In this case, it is left empty as there are no specific resources that need to be released when the Client object is destroyed. However, it is good practice to define a destructor in case any future modifications to the Client class require cleanup of resources.</w:t>
+      </w:r>
+    </w:p>
+    <w:p>
+      <w:r>
+        <w:t>    ~</w:t>
+      </w:r>
+      <w:proofErr w:type="gramStart"/>
+      <w:r>
+        <w:t>Client(</w:t>
+      </w:r>
+      <w:proofErr w:type="gramEnd"/>
+      <w:r>
+        <w:t>) {}</w:t>
       </w:r>
     </w:p>
     <w:p/>
@@ -2483,8 +3098,13 @@
     </w:p>
     <w:p>
       <w:r>
-        <w:t>    void run();</w:t>
-      </w:r>
+        <w:t xml:space="preserve">    void </w:t>
+      </w:r>
+      <w:proofErr w:type="gramStart"/>
+      <w:r>
+        <w:t>run();</w:t>
+      </w:r>
+      <w:proofErr w:type="gramEnd"/>
     </w:p>
     <w:p/>
     <w:p>
@@ -2513,6 +3133,7 @@
         <w:t xml:space="preserve">    string </w:t>
       </w:r>
       <w:proofErr w:type="spellStart"/>
+      <w:proofErr w:type="gramStart"/>
       <w:r>
         <w:t>serverIp</w:t>
       </w:r>
@@ -2520,6 +3141,7 @@
       <w:r>
         <w:t>;</w:t>
       </w:r>
+      <w:proofErr w:type="gramEnd"/>
     </w:p>
     <w:p>
       <w:r>
@@ -2528,13 +3150,20 @@
     </w:p>
     <w:p>
       <w:r>
-        <w:t>    int port;</w:t>
-      </w:r>
-    </w:p>
-    <w:p>
+        <w:t xml:space="preserve">    int </w:t>
+      </w:r>
+      <w:proofErr w:type="gramStart"/>
+      <w:r>
+        <w:t>port;</w:t>
+      </w:r>
+      <w:proofErr w:type="gramEnd"/>
+    </w:p>
+    <w:p>
+      <w:proofErr w:type="gramStart"/>
       <w:r>
         <w:t>};</w:t>
       </w:r>
+      <w:proofErr w:type="gramEnd"/>
     </w:p>
     <w:p/>
     <w:p>
@@ -2544,7 +3173,15 @@
     </w:p>
     <w:p>
       <w:r>
-        <w:t>// The include guard is closed here to prevent multiple inclusions of this header file.</w:t>
+        <w:t xml:space="preserve">// </w:t>
+      </w:r>
+      <w:proofErr w:type="gramStart"/>
+      <w:r>
+        <w:t>The include</w:t>
+      </w:r>
+      <w:proofErr w:type="gramEnd"/>
+      <w:r>
+        <w:t xml:space="preserve"> guard is closed here to prevent multiple inclusions of this header file.</w:t>
       </w:r>
     </w:p>
     <w:p>
@@ -2617,7 +3254,15 @@
     <w:p/>
     <w:p>
       <w:r>
-        <w:t xml:space="preserve">//!SECTION: The Server class is defined and implemented in this </w:t>
+        <w:t>/</w:t>
+      </w:r>
+      <w:proofErr w:type="gramStart"/>
+      <w:r>
+        <w:t>/!SECTION</w:t>
+      </w:r>
+      <w:proofErr w:type="gramEnd"/>
+      <w:r>
+        <w:t xml:space="preserve">: The Server class is defined and implemented in this </w:t>
       </w:r>
       <w:proofErr w:type="spellStart"/>
       <w:r>
@@ -2648,49 +3293,89 @@
       </w:r>
     </w:p>
     <w:p>
-      <w:r>
-        <w:t>#include "</w:t>
-      </w:r>
-      <w:proofErr w:type="spellStart"/>
-      <w:r>
-        <w:t>Server.h</w:t>
-      </w:r>
-      <w:proofErr w:type="spellEnd"/>
+      <w:proofErr w:type="gramStart"/>
+      <w:r>
+        <w:t>#include</w:t>
+      </w:r>
+      <w:proofErr w:type="gramEnd"/>
+      <w:r>
+        <w:t xml:space="preserve"> "</w:t>
+      </w:r>
+      <w:proofErr w:type="spellStart"/>
+      <w:r>
+        <w:t>Server</w:t>
+      </w:r>
+      <w:proofErr w:type="gramStart"/>
+      <w:r>
+        <w:t>.h</w:t>
+      </w:r>
+      <w:proofErr w:type="spellEnd"/>
+      <w:proofErr w:type="gramEnd"/>
       <w:r>
         <w:t>"</w:t>
       </w:r>
     </w:p>
     <w:p>
-      <w:r>
-        <w:t>#include &lt;iostream&gt;</w:t>
-      </w:r>
-    </w:p>
-    <w:p>
-      <w:r>
-        <w:t>#include &lt;winsock2.h&gt;</w:t>
-      </w:r>
-    </w:p>
-    <w:p>
-      <w:r>
-        <w:t>#include &lt;</w:t>
-      </w:r>
-      <w:proofErr w:type="spellStart"/>
-      <w:r>
-        <w:t>windows.h</w:t>
-      </w:r>
-      <w:proofErr w:type="spellEnd"/>
+      <w:proofErr w:type="gramStart"/>
+      <w:r>
+        <w:t>#include</w:t>
+      </w:r>
+      <w:proofErr w:type="gramEnd"/>
+      <w:r>
+        <w:t xml:space="preserve"> &lt;iostream&gt;</w:t>
+      </w:r>
+    </w:p>
+    <w:p>
+      <w:proofErr w:type="gramStart"/>
+      <w:r>
+        <w:t>#include</w:t>
+      </w:r>
+      <w:proofErr w:type="gramEnd"/>
+      <w:r>
+        <w:t xml:space="preserve"> &lt;winsock2.h&gt;</w:t>
+      </w:r>
+    </w:p>
+    <w:p>
+      <w:proofErr w:type="gramStart"/>
+      <w:r>
+        <w:t>#include</w:t>
+      </w:r>
+      <w:proofErr w:type="gramEnd"/>
+      <w:r>
+        <w:t xml:space="preserve"> &lt;</w:t>
+      </w:r>
+      <w:proofErr w:type="spellStart"/>
+      <w:r>
+        <w:t>windows</w:t>
+      </w:r>
+      <w:proofErr w:type="gramStart"/>
+      <w:r>
+        <w:t>.h</w:t>
+      </w:r>
+      <w:proofErr w:type="spellEnd"/>
+      <w:proofErr w:type="gramEnd"/>
       <w:r>
         <w:t>&gt;</w:t>
       </w:r>
     </w:p>
     <w:p>
-      <w:r>
-        <w:t>#include &lt;ws2tcpip.h&gt;</w:t>
-      </w:r>
-    </w:p>
-    <w:p>
-      <w:r>
-        <w:t>#include &lt;</w:t>
+      <w:proofErr w:type="gramStart"/>
+      <w:r>
+        <w:t>#include</w:t>
+      </w:r>
+      <w:proofErr w:type="gramEnd"/>
+      <w:r>
+        <w:t xml:space="preserve"> &lt;ws2tcpip.h&gt;</w:t>
+      </w:r>
+    </w:p>
+    <w:p>
+      <w:proofErr w:type="gramStart"/>
+      <w:r>
+        <w:t>#include</w:t>
+      </w:r>
+      <w:proofErr w:type="gramEnd"/>
+      <w:r>
+        <w:t xml:space="preserve"> &lt;</w:t>
       </w:r>
       <w:proofErr w:type="spellStart"/>
       <w:r>
@@ -2702,8 +3387,13 @@
       </w:r>
     </w:p>
     <w:p>
-      <w:r>
-        <w:t>#include &lt;</w:t>
+      <w:proofErr w:type="gramStart"/>
+      <w:r>
+        <w:t>#include</w:t>
+      </w:r>
+      <w:proofErr w:type="gramEnd"/>
+      <w:r>
+        <w:t xml:space="preserve"> &lt;</w:t>
       </w:r>
       <w:proofErr w:type="spellStart"/>
       <w:r>
@@ -2721,8 +3411,13 @@
     </w:p>
     <w:p>
       <w:r>
-        <w:t>using namespace std;</w:t>
-      </w:r>
+        <w:t xml:space="preserve">using namespace </w:t>
+      </w:r>
+      <w:proofErr w:type="gramStart"/>
+      <w:r>
+        <w:t>std;</w:t>
+      </w:r>
+      <w:proofErr w:type="gramEnd"/>
     </w:p>
     <w:p/>
     <w:p>
@@ -2736,9 +3431,27 @@
       </w:r>
     </w:p>
     <w:p>
-      <w:r>
-        <w:t>Server::Server(int port) : port(port) {</w:t>
-      </w:r>
+      <w:proofErr w:type="gramStart"/>
+      <w:r>
+        <w:t>Server::Server(</w:t>
+      </w:r>
+      <w:proofErr w:type="gramEnd"/>
+      <w:r>
+        <w:t>int port</w:t>
+      </w:r>
+      <w:proofErr w:type="gramStart"/>
+      <w:r>
+        <w:t>) :</w:t>
+      </w:r>
+      <w:proofErr w:type="gramEnd"/>
+      <w:r>
+        <w:t xml:space="preserve"> port(</w:t>
+      </w:r>
+      <w:proofErr w:type="gramStart"/>
+      <w:r>
+        <w:t>port) {</w:t>
+      </w:r>
+      <w:proofErr w:type="gramEnd"/>
     </w:p>
     <w:p>
       <w:r>
@@ -2755,8 +3468,13 @@
       </w:r>
       <w:proofErr w:type="spellEnd"/>
       <w:r>
-        <w:t>["AL"] = "Alabama";</w:t>
-      </w:r>
+        <w:t>["AL"] = "Alabama</w:t>
+      </w:r>
+      <w:proofErr w:type="gramStart"/>
+      <w:r>
+        <w:t>";</w:t>
+      </w:r>
+      <w:proofErr w:type="gramEnd"/>
     </w:p>
     <w:p>
       <w:r>
@@ -2768,8 +3486,13 @@
       </w:r>
       <w:proofErr w:type="spellEnd"/>
       <w:r>
-        <w:t>["AK"] = "Alaska";</w:t>
-      </w:r>
+        <w:t>["AK"] = "Alaska</w:t>
+      </w:r>
+      <w:proofErr w:type="gramStart"/>
+      <w:r>
+        <w:t>";</w:t>
+      </w:r>
+      <w:proofErr w:type="gramEnd"/>
     </w:p>
     <w:p>
       <w:r>
@@ -2781,8 +3504,13 @@
       </w:r>
       <w:proofErr w:type="spellEnd"/>
       <w:r>
-        <w:t>["AZ"] = "Arizona";</w:t>
-      </w:r>
+        <w:t>["AZ"] = "Arizona</w:t>
+      </w:r>
+      <w:proofErr w:type="gramStart"/>
+      <w:r>
+        <w:t>";</w:t>
+      </w:r>
+      <w:proofErr w:type="gramEnd"/>
     </w:p>
     <w:p>
       <w:r>
@@ -2795,8 +3523,13 @@
       </w:r>
       <w:proofErr w:type="spellEnd"/>
       <w:r>
-        <w:t>["AR"] = "Arkansas";</w:t>
-      </w:r>
+        <w:t>["AR"] = "Arkansas</w:t>
+      </w:r>
+      <w:proofErr w:type="gramStart"/>
+      <w:r>
+        <w:t>";</w:t>
+      </w:r>
+      <w:proofErr w:type="gramEnd"/>
     </w:p>
     <w:p>
       <w:r>
@@ -2808,8 +3541,13 @@
       </w:r>
       <w:proofErr w:type="spellEnd"/>
       <w:r>
-        <w:t>["CA"] = "California";</w:t>
-      </w:r>
+        <w:t>["CA"] = "California</w:t>
+      </w:r>
+      <w:proofErr w:type="gramStart"/>
+      <w:r>
+        <w:t>";</w:t>
+      </w:r>
+      <w:proofErr w:type="gramEnd"/>
     </w:p>
     <w:p>
       <w:r>
@@ -2821,8 +3559,13 @@
       </w:r>
       <w:proofErr w:type="spellEnd"/>
       <w:r>
-        <w:t>["CO"] = "Colorado";</w:t>
-      </w:r>
+        <w:t>["CO"] = "Colorado</w:t>
+      </w:r>
+      <w:proofErr w:type="gramStart"/>
+      <w:r>
+        <w:t>";</w:t>
+      </w:r>
+      <w:proofErr w:type="gramEnd"/>
     </w:p>
     <w:p>
       <w:r>
@@ -2834,8 +3577,13 @@
       </w:r>
       <w:proofErr w:type="spellEnd"/>
       <w:r>
-        <w:t>["CT"] = "Connecticut";</w:t>
-      </w:r>
+        <w:t>["CT"] = "Connecticut</w:t>
+      </w:r>
+      <w:proofErr w:type="gramStart"/>
+      <w:r>
+        <w:t>";</w:t>
+      </w:r>
+      <w:proofErr w:type="gramEnd"/>
     </w:p>
     <w:p>
       <w:r>
@@ -2847,8 +3595,13 @@
       </w:r>
       <w:proofErr w:type="spellEnd"/>
       <w:r>
-        <w:t>["DE"] = "Delaware";</w:t>
-      </w:r>
+        <w:t>["DE"] = "Delaware</w:t>
+      </w:r>
+      <w:proofErr w:type="gramStart"/>
+      <w:r>
+        <w:t>";</w:t>
+      </w:r>
+      <w:proofErr w:type="gramEnd"/>
     </w:p>
     <w:p>
       <w:r>
@@ -2860,8 +3613,13 @@
       </w:r>
       <w:proofErr w:type="spellEnd"/>
       <w:r>
-        <w:t>["FL"] = "Florida";</w:t>
-      </w:r>
+        <w:t>["FL"] = "Florida</w:t>
+      </w:r>
+      <w:proofErr w:type="gramStart"/>
+      <w:r>
+        <w:t>";</w:t>
+      </w:r>
+      <w:proofErr w:type="gramEnd"/>
     </w:p>
     <w:p>
       <w:r>
@@ -2873,8 +3631,13 @@
       </w:r>
       <w:proofErr w:type="spellEnd"/>
       <w:r>
-        <w:t>["GA"] = "Georgia";</w:t>
-      </w:r>
+        <w:t>["GA"] = "Georgia</w:t>
+      </w:r>
+      <w:proofErr w:type="gramStart"/>
+      <w:r>
+        <w:t>";</w:t>
+      </w:r>
+      <w:proofErr w:type="gramEnd"/>
     </w:p>
     <w:p>
       <w:r>
@@ -2886,8 +3649,13 @@
       </w:r>
       <w:proofErr w:type="spellEnd"/>
       <w:r>
-        <w:t>["HI"] = "Hawaii";</w:t>
-      </w:r>
+        <w:t>["HI"] = "Hawaii</w:t>
+      </w:r>
+      <w:proofErr w:type="gramStart"/>
+      <w:r>
+        <w:t>";</w:t>
+      </w:r>
+      <w:proofErr w:type="gramEnd"/>
     </w:p>
     <w:p>
       <w:r>
@@ -2899,8 +3667,13 @@
       </w:r>
       <w:proofErr w:type="spellEnd"/>
       <w:r>
-        <w:t>["ID"] = "Idaho";</w:t>
-      </w:r>
+        <w:t>["ID"] = "Idaho</w:t>
+      </w:r>
+      <w:proofErr w:type="gramStart"/>
+      <w:r>
+        <w:t>";</w:t>
+      </w:r>
+      <w:proofErr w:type="gramEnd"/>
     </w:p>
     <w:p>
       <w:r>
@@ -2912,8 +3685,13 @@
       </w:r>
       <w:proofErr w:type="spellEnd"/>
       <w:r>
-        <w:t>["IL"] = "Illinois";</w:t>
-      </w:r>
+        <w:t>["IL"] = "Illinois</w:t>
+      </w:r>
+      <w:proofErr w:type="gramStart"/>
+      <w:r>
+        <w:t>";</w:t>
+      </w:r>
+      <w:proofErr w:type="gramEnd"/>
     </w:p>
     <w:p>
       <w:r>
@@ -2925,8 +3703,13 @@
       </w:r>
       <w:proofErr w:type="spellEnd"/>
       <w:r>
-        <w:t>["IN"] = "Indiana";</w:t>
-      </w:r>
+        <w:t>["IN"] = "Indiana</w:t>
+      </w:r>
+      <w:proofErr w:type="gramStart"/>
+      <w:r>
+        <w:t>";</w:t>
+      </w:r>
+      <w:proofErr w:type="gramEnd"/>
     </w:p>
     <w:p>
       <w:r>
@@ -2938,8 +3721,13 @@
       </w:r>
       <w:proofErr w:type="spellEnd"/>
       <w:r>
-        <w:t>["IA"] = "Iowa";</w:t>
-      </w:r>
+        <w:t>["IA"] = "Iowa</w:t>
+      </w:r>
+      <w:proofErr w:type="gramStart"/>
+      <w:r>
+        <w:t>";</w:t>
+      </w:r>
+      <w:proofErr w:type="gramEnd"/>
     </w:p>
     <w:p>
       <w:r>
@@ -2951,8 +3739,13 @@
       </w:r>
       <w:proofErr w:type="spellEnd"/>
       <w:r>
-        <w:t>["KS"] = "Kansas";</w:t>
-      </w:r>
+        <w:t>["KS"] = "Kansas</w:t>
+      </w:r>
+      <w:proofErr w:type="gramStart"/>
+      <w:r>
+        <w:t>";</w:t>
+      </w:r>
+      <w:proofErr w:type="gramEnd"/>
     </w:p>
     <w:p>
       <w:r>
@@ -2964,8 +3757,13 @@
       </w:r>
       <w:proofErr w:type="spellEnd"/>
       <w:r>
-        <w:t>["KY"] = "Kentucky";</w:t>
-      </w:r>
+        <w:t>["KY"] = "Kentucky</w:t>
+      </w:r>
+      <w:proofErr w:type="gramStart"/>
+      <w:r>
+        <w:t>";</w:t>
+      </w:r>
+      <w:proofErr w:type="gramEnd"/>
     </w:p>
     <w:p>
       <w:r>
@@ -2977,8 +3775,13 @@
       </w:r>
       <w:proofErr w:type="spellEnd"/>
       <w:r>
-        <w:t>["LA"] = "Louisiana";</w:t>
-      </w:r>
+        <w:t>["LA"] = "Louisiana</w:t>
+      </w:r>
+      <w:proofErr w:type="gramStart"/>
+      <w:r>
+        <w:t>";</w:t>
+      </w:r>
+      <w:proofErr w:type="gramEnd"/>
     </w:p>
     <w:p>
       <w:r>
@@ -2990,8 +3793,13 @@
       </w:r>
       <w:proofErr w:type="spellEnd"/>
       <w:r>
-        <w:t>["ME"] = "Maine";</w:t>
-      </w:r>
+        <w:t>["ME"] = "Maine</w:t>
+      </w:r>
+      <w:proofErr w:type="gramStart"/>
+      <w:r>
+        <w:t>";</w:t>
+      </w:r>
+      <w:proofErr w:type="gramEnd"/>
     </w:p>
     <w:p>
       <w:r>
@@ -3003,8 +3811,13 @@
       </w:r>
       <w:proofErr w:type="spellEnd"/>
       <w:r>
-        <w:t>["MD"] = "Maryland";</w:t>
-      </w:r>
+        <w:t>["MD"] = "Maryland</w:t>
+      </w:r>
+      <w:proofErr w:type="gramStart"/>
+      <w:r>
+        <w:t>";</w:t>
+      </w:r>
+      <w:proofErr w:type="gramEnd"/>
     </w:p>
     <w:p>
       <w:r>
@@ -3016,8 +3829,13 @@
       </w:r>
       <w:proofErr w:type="spellEnd"/>
       <w:r>
-        <w:t>["MA"] = "Massachusetts";</w:t>
-      </w:r>
+        <w:t>["MA"] = "Massachusetts</w:t>
+      </w:r>
+      <w:proofErr w:type="gramStart"/>
+      <w:r>
+        <w:t>";</w:t>
+      </w:r>
+      <w:proofErr w:type="gramEnd"/>
     </w:p>
     <w:p>
       <w:r>
@@ -3029,8 +3847,13 @@
       </w:r>
       <w:proofErr w:type="spellEnd"/>
       <w:r>
-        <w:t>["MI"] = "Michigan";</w:t>
-      </w:r>
+        <w:t>["MI"] = "Michigan</w:t>
+      </w:r>
+      <w:proofErr w:type="gramStart"/>
+      <w:r>
+        <w:t>";</w:t>
+      </w:r>
+      <w:proofErr w:type="gramEnd"/>
     </w:p>
     <w:p>
       <w:r>
@@ -3042,8 +3865,13 @@
       </w:r>
       <w:proofErr w:type="spellEnd"/>
       <w:r>
-        <w:t>["MN"] = "Minnesota";</w:t>
-      </w:r>
+        <w:t>["MN"] = "Minnesota</w:t>
+      </w:r>
+      <w:proofErr w:type="gramStart"/>
+      <w:r>
+        <w:t>";</w:t>
+      </w:r>
+      <w:proofErr w:type="gramEnd"/>
     </w:p>
     <w:p>
       <w:r>
@@ -3055,8 +3883,13 @@
       </w:r>
       <w:proofErr w:type="spellEnd"/>
       <w:r>
-        <w:t>["MS"] = "Mississippi";</w:t>
-      </w:r>
+        <w:t>["MS"] = "Mississippi</w:t>
+      </w:r>
+      <w:proofErr w:type="gramStart"/>
+      <w:r>
+        <w:t>";</w:t>
+      </w:r>
+      <w:proofErr w:type="gramEnd"/>
     </w:p>
     <w:p>
       <w:r>
@@ -3068,8 +3901,13 @@
       </w:r>
       <w:proofErr w:type="spellEnd"/>
       <w:r>
-        <w:t>["MO"] = "Missouri";</w:t>
-      </w:r>
+        <w:t>["MO"] = "Missouri</w:t>
+      </w:r>
+      <w:proofErr w:type="gramStart"/>
+      <w:r>
+        <w:t>";</w:t>
+      </w:r>
+      <w:proofErr w:type="gramEnd"/>
     </w:p>
     <w:p>
       <w:r>
@@ -3081,8 +3919,13 @@
       </w:r>
       <w:proofErr w:type="spellEnd"/>
       <w:r>
-        <w:t>["MT"] = "Montana";</w:t>
-      </w:r>
+        <w:t>["MT"] = "Montana</w:t>
+      </w:r>
+      <w:proofErr w:type="gramStart"/>
+      <w:r>
+        <w:t>";</w:t>
+      </w:r>
+      <w:proofErr w:type="gramEnd"/>
     </w:p>
     <w:p>
       <w:r>
@@ -3094,8 +3937,13 @@
       </w:r>
       <w:proofErr w:type="spellEnd"/>
       <w:r>
-        <w:t>["NE"] = "Nebraska";</w:t>
-      </w:r>
+        <w:t>["NE"] = "Nebraska</w:t>
+      </w:r>
+      <w:proofErr w:type="gramStart"/>
+      <w:r>
+        <w:t>";</w:t>
+      </w:r>
+      <w:proofErr w:type="gramEnd"/>
     </w:p>
     <w:p>
       <w:r>
@@ -3107,8 +3955,13 @@
       </w:r>
       <w:proofErr w:type="spellEnd"/>
       <w:r>
-        <w:t>["NV"] = "Nevada";</w:t>
-      </w:r>
+        <w:t>["NV"] = "Nevada</w:t>
+      </w:r>
+      <w:proofErr w:type="gramStart"/>
+      <w:r>
+        <w:t>";</w:t>
+      </w:r>
+      <w:proofErr w:type="gramEnd"/>
     </w:p>
     <w:p>
       <w:r>
@@ -3120,8 +3973,13 @@
       </w:r>
       <w:proofErr w:type="spellEnd"/>
       <w:r>
-        <w:t>["NH"] = "New Hampshire";</w:t>
-      </w:r>
+        <w:t>["NH"] = "New Hampshire</w:t>
+      </w:r>
+      <w:proofErr w:type="gramStart"/>
+      <w:r>
+        <w:t>";</w:t>
+      </w:r>
+      <w:proofErr w:type="gramEnd"/>
     </w:p>
     <w:p>
       <w:r>
@@ -3133,8 +3991,13 @@
       </w:r>
       <w:proofErr w:type="spellEnd"/>
       <w:r>
-        <w:t>["NJ"] = "New Jersey";</w:t>
-      </w:r>
+        <w:t>["NJ"] = "New Jersey</w:t>
+      </w:r>
+      <w:proofErr w:type="gramStart"/>
+      <w:r>
+        <w:t>";</w:t>
+      </w:r>
+      <w:proofErr w:type="gramEnd"/>
     </w:p>
     <w:p>
       <w:r>
@@ -3146,8 +4009,13 @@
       </w:r>
       <w:proofErr w:type="spellEnd"/>
       <w:r>
-        <w:t>["NM"] = "New Mexico";</w:t>
-      </w:r>
+        <w:t>["NM"] = "New Mexico</w:t>
+      </w:r>
+      <w:proofErr w:type="gramStart"/>
+      <w:r>
+        <w:t>";</w:t>
+      </w:r>
+      <w:proofErr w:type="gramEnd"/>
     </w:p>
     <w:p>
       <w:r>
@@ -3159,8 +4027,13 @@
       </w:r>
       <w:proofErr w:type="spellEnd"/>
       <w:r>
-        <w:t>["NY"] = "New York";</w:t>
-      </w:r>
+        <w:t>["NY"] = "New York</w:t>
+      </w:r>
+      <w:proofErr w:type="gramStart"/>
+      <w:r>
+        <w:t>";</w:t>
+      </w:r>
+      <w:proofErr w:type="gramEnd"/>
     </w:p>
     <w:p>
       <w:r>
@@ -3173,8 +4046,13 @@
       </w:r>
       <w:proofErr w:type="spellEnd"/>
       <w:r>
-        <w:t>["NC"] = "North Carolina";</w:t>
-      </w:r>
+        <w:t>["NC"] = "North Carolina</w:t>
+      </w:r>
+      <w:proofErr w:type="gramStart"/>
+      <w:r>
+        <w:t>";</w:t>
+      </w:r>
+      <w:proofErr w:type="gramEnd"/>
     </w:p>
     <w:p>
       <w:r>
@@ -3186,8 +4064,13 @@
       </w:r>
       <w:proofErr w:type="spellEnd"/>
       <w:r>
-        <w:t>["ND"] = "North Dakota";</w:t>
-      </w:r>
+        <w:t>["ND"] = "North Dakota</w:t>
+      </w:r>
+      <w:proofErr w:type="gramStart"/>
+      <w:r>
+        <w:t>";</w:t>
+      </w:r>
+      <w:proofErr w:type="gramEnd"/>
     </w:p>
     <w:p>
       <w:r>
@@ -3199,8 +4082,13 @@
       </w:r>
       <w:proofErr w:type="spellEnd"/>
       <w:r>
-        <w:t>["OH"] = "Ohio";</w:t>
-      </w:r>
+        <w:t>["OH"] = "Ohio</w:t>
+      </w:r>
+      <w:proofErr w:type="gramStart"/>
+      <w:r>
+        <w:t>";</w:t>
+      </w:r>
+      <w:proofErr w:type="gramEnd"/>
     </w:p>
     <w:p>
       <w:r>
@@ -3212,8 +4100,13 @@
       </w:r>
       <w:proofErr w:type="spellEnd"/>
       <w:r>
-        <w:t>["OK"] = "Oklahoma";</w:t>
-      </w:r>
+        <w:t>["OK"] = "Oklahoma</w:t>
+      </w:r>
+      <w:proofErr w:type="gramStart"/>
+      <w:r>
+        <w:t>";</w:t>
+      </w:r>
+      <w:proofErr w:type="gramEnd"/>
     </w:p>
     <w:p>
       <w:r>
@@ -3225,8 +4118,13 @@
       </w:r>
       <w:proofErr w:type="spellEnd"/>
       <w:r>
-        <w:t>["OR"] = "Oregon";</w:t>
-      </w:r>
+        <w:t>["OR"] = "Oregon</w:t>
+      </w:r>
+      <w:proofErr w:type="gramStart"/>
+      <w:r>
+        <w:t>";</w:t>
+      </w:r>
+      <w:proofErr w:type="gramEnd"/>
     </w:p>
     <w:p>
       <w:r>
@@ -3238,8 +4136,13 @@
       </w:r>
       <w:proofErr w:type="spellEnd"/>
       <w:r>
-        <w:t>["PA"] = "Pennsylvania";</w:t>
-      </w:r>
+        <w:t>["PA"] = "Pennsylvania</w:t>
+      </w:r>
+      <w:proofErr w:type="gramStart"/>
+      <w:r>
+        <w:t>";</w:t>
+      </w:r>
+      <w:proofErr w:type="gramEnd"/>
     </w:p>
     <w:p>
       <w:r>
@@ -3251,8 +4154,13 @@
       </w:r>
       <w:proofErr w:type="spellEnd"/>
       <w:r>
-        <w:t>["RI"] = "Rhode Island";</w:t>
-      </w:r>
+        <w:t>["RI"] = "Rhode Island</w:t>
+      </w:r>
+      <w:proofErr w:type="gramStart"/>
+      <w:r>
+        <w:t>";</w:t>
+      </w:r>
+      <w:proofErr w:type="gramEnd"/>
     </w:p>
     <w:p>
       <w:r>
@@ -3264,8 +4172,13 @@
       </w:r>
       <w:proofErr w:type="spellEnd"/>
       <w:r>
-        <w:t>["SC"] = "South Carolina";</w:t>
-      </w:r>
+        <w:t>["SC"] = "South Carolina</w:t>
+      </w:r>
+      <w:proofErr w:type="gramStart"/>
+      <w:r>
+        <w:t>";</w:t>
+      </w:r>
+      <w:proofErr w:type="gramEnd"/>
     </w:p>
     <w:p>
       <w:r>
@@ -3277,8 +4190,13 @@
       </w:r>
       <w:proofErr w:type="spellEnd"/>
       <w:r>
-        <w:t>["SD"] = "South Dakota";</w:t>
-      </w:r>
+        <w:t>["SD"] = "South Dakota</w:t>
+      </w:r>
+      <w:proofErr w:type="gramStart"/>
+      <w:r>
+        <w:t>";</w:t>
+      </w:r>
+      <w:proofErr w:type="gramEnd"/>
     </w:p>
     <w:p>
       <w:r>
@@ -3290,8 +4208,21 @@
       </w:r>
       <w:proofErr w:type="spellEnd"/>
       <w:r>
-        <w:t>["TN"] = "Tennessee";</w:t>
-      </w:r>
+        <w:t>["</w:t>
+      </w:r>
+      <w:proofErr w:type="gramStart"/>
+      <w:r>
+        <w:t>TN"]</w:t>
+      </w:r>
+      <w:proofErr w:type="gramEnd"/>
+      <w:r>
+        <w:t xml:space="preserve"> = "Tennessee</w:t>
+      </w:r>
+      <w:proofErr w:type="gramStart"/>
+      <w:r>
+        <w:t>";</w:t>
+      </w:r>
+      <w:proofErr w:type="gramEnd"/>
     </w:p>
     <w:p>
       <w:r>
@@ -3303,8 +4234,13 @@
       </w:r>
       <w:proofErr w:type="spellEnd"/>
       <w:r>
-        <w:t>["TX"] = "Texas";</w:t>
-      </w:r>
+        <w:t>["TX"] = "Texas</w:t>
+      </w:r>
+      <w:proofErr w:type="gramStart"/>
+      <w:r>
+        <w:t>";</w:t>
+      </w:r>
+      <w:proofErr w:type="gramEnd"/>
     </w:p>
     <w:p>
       <w:r>
@@ -3316,8 +4252,13 @@
       </w:r>
       <w:proofErr w:type="spellEnd"/>
       <w:r>
-        <w:t>["UT"] = "Utah";</w:t>
-      </w:r>
+        <w:t>["UT"] = "Utah</w:t>
+      </w:r>
+      <w:proofErr w:type="gramStart"/>
+      <w:r>
+        <w:t>";</w:t>
+      </w:r>
+      <w:proofErr w:type="gramEnd"/>
     </w:p>
     <w:p>
       <w:r>
@@ -3329,8 +4270,13 @@
       </w:r>
       <w:proofErr w:type="spellEnd"/>
       <w:r>
-        <w:t>["VT"] = "Vermont";</w:t>
-      </w:r>
+        <w:t>["VT"] = "Vermont</w:t>
+      </w:r>
+      <w:proofErr w:type="gramStart"/>
+      <w:r>
+        <w:t>";</w:t>
+      </w:r>
+      <w:proofErr w:type="gramEnd"/>
     </w:p>
     <w:p>
       <w:r>
@@ -3342,8 +4288,13 @@
       </w:r>
       <w:proofErr w:type="spellEnd"/>
       <w:r>
-        <w:t>["VA"] = "Virginia";</w:t>
-      </w:r>
+        <w:t>["VA"] = "Virginia</w:t>
+      </w:r>
+      <w:proofErr w:type="gramStart"/>
+      <w:r>
+        <w:t>";</w:t>
+      </w:r>
+      <w:proofErr w:type="gramEnd"/>
     </w:p>
     <w:p>
       <w:r>
@@ -3355,8 +4306,13 @@
       </w:r>
       <w:proofErr w:type="spellEnd"/>
       <w:r>
-        <w:t>["WA"] = "Washington";</w:t>
-      </w:r>
+        <w:t>["WA"] = "Washington</w:t>
+      </w:r>
+      <w:proofErr w:type="gramStart"/>
+      <w:r>
+        <w:t>";</w:t>
+      </w:r>
+      <w:proofErr w:type="gramEnd"/>
     </w:p>
     <w:p>
       <w:r>
@@ -3368,8 +4324,13 @@
       </w:r>
       <w:proofErr w:type="spellEnd"/>
       <w:r>
-        <w:t>["WV"] = "West Virginia";</w:t>
-      </w:r>
+        <w:t>["WV"] = "West Virginia</w:t>
+      </w:r>
+      <w:proofErr w:type="gramStart"/>
+      <w:r>
+        <w:t>";</w:t>
+      </w:r>
+      <w:proofErr w:type="gramEnd"/>
     </w:p>
     <w:p>
       <w:r>
@@ -3381,8 +4342,13 @@
       </w:r>
       <w:proofErr w:type="spellEnd"/>
       <w:r>
-        <w:t>["WI"] = "Wisconsin";</w:t>
-      </w:r>
+        <w:t>["WI"] = "Wisconsin</w:t>
+      </w:r>
+      <w:proofErr w:type="gramStart"/>
+      <w:r>
+        <w:t>";</w:t>
+      </w:r>
+      <w:proofErr w:type="gramEnd"/>
     </w:p>
     <w:p>
       <w:r>
@@ -3394,8 +4360,13 @@
       </w:r>
       <w:proofErr w:type="spellEnd"/>
       <w:r>
-        <w:t>["WY"] = "Wyoming";</w:t>
-      </w:r>
+        <w:t>["WY"] = "Wyoming</w:t>
+      </w:r>
+      <w:proofErr w:type="gramStart"/>
+      <w:r>
+        <w:t>";</w:t>
+      </w:r>
+      <w:proofErr w:type="gramEnd"/>
     </w:p>
     <w:p>
       <w:r>
@@ -3423,7 +4394,15 @@
     </w:p>
     <w:p>
       <w:r>
-        <w:t>void Server::start() {</w:t>
+        <w:t xml:space="preserve">void </w:t>
+      </w:r>
+      <w:proofErr w:type="gramStart"/>
+      <w:r>
+        <w:t>Server::start(</w:t>
+      </w:r>
+      <w:proofErr w:type="gramEnd"/>
+      <w:r>
+        <w:t>) {</w:t>
       </w:r>
     </w:p>
     <w:p/>
@@ -3451,6 +4430,7 @@
         <w:t xml:space="preserve">    WSADATA </w:t>
       </w:r>
       <w:proofErr w:type="spellStart"/>
+      <w:proofErr w:type="gramStart"/>
       <w:r>
         <w:t>wsaData</w:t>
       </w:r>
@@ -3458,6 +4438,7 @@
       <w:r>
         <w:t>;</w:t>
       </w:r>
+      <w:proofErr w:type="gramEnd"/>
     </w:p>
     <w:p>
       <w:r>
@@ -3469,21 +4450,36 @@
         <w:t>    if (</w:t>
       </w:r>
       <w:proofErr w:type="spellStart"/>
+      <w:proofErr w:type="gramStart"/>
       <w:r>
         <w:t>WSAStartup</w:t>
       </w:r>
       <w:proofErr w:type="spellEnd"/>
       <w:r>
-        <w:t>(MAKEWORD(2, 2), &amp;</w:t>
+        <w:t>(MAKEWORD(</w:t>
+      </w:r>
+      <w:proofErr w:type="gramEnd"/>
+      <w:r>
+        <w:t>2, 2), &amp;</w:t>
       </w:r>
       <w:proofErr w:type="spellStart"/>
       <w:r>
         <w:t>wsaData</w:t>
       </w:r>
       <w:proofErr w:type="spellEnd"/>
-      <w:r>
-        <w:t>) != 0) {</w:t>
-      </w:r>
+      <w:proofErr w:type="gramStart"/>
+      <w:r>
+        <w:t>) !</w:t>
+      </w:r>
+      <w:proofErr w:type="gramEnd"/>
+      <w:r>
+        <w:t xml:space="preserve">= </w:t>
+      </w:r>
+      <w:proofErr w:type="gramStart"/>
+      <w:r>
+        <w:t>0) {</w:t>
+      </w:r>
+      <w:proofErr w:type="gramEnd"/>
     </w:p>
     <w:p>
       <w:r>
@@ -3506,6 +4502,7 @@
         <w:t xml:space="preserve"> failed" &lt;&lt; </w:t>
       </w:r>
       <w:proofErr w:type="spellStart"/>
+      <w:proofErr w:type="gramStart"/>
       <w:r>
         <w:t>endl</w:t>
       </w:r>
@@ -3513,11 +4510,17 @@
       <w:r>
         <w:t>;</w:t>
       </w:r>
-    </w:p>
-    <w:p>
-      <w:r>
-        <w:t>        return;</w:t>
-      </w:r>
+      <w:proofErr w:type="gramEnd"/>
+    </w:p>
+    <w:p>
+      <w:r>
+        <w:t xml:space="preserve">        </w:t>
+      </w:r>
+      <w:proofErr w:type="gramStart"/>
+      <w:r>
+        <w:t>return;</w:t>
+      </w:r>
+      <w:proofErr w:type="gramEnd"/>
     </w:p>
     <w:p>
       <w:r>
@@ -3553,8 +4556,21 @@
       </w:r>
       <w:proofErr w:type="spellEnd"/>
       <w:r>
-        <w:t xml:space="preserve"> = socket(AF_INET, SOCK_STREAM, 0);</w:t>
-      </w:r>
+        <w:t xml:space="preserve"> = </w:t>
+      </w:r>
+      <w:proofErr w:type="gramStart"/>
+      <w:r>
+        <w:t>socket(</w:t>
+      </w:r>
+      <w:proofErr w:type="gramEnd"/>
+      <w:r>
+        <w:t>AF_INET, SOCK_STREAM, 0</w:t>
+      </w:r>
+      <w:proofErr w:type="gramStart"/>
+      <w:r>
+        <w:t>);</w:t>
+      </w:r>
+      <w:proofErr w:type="gramEnd"/>
     </w:p>
     <w:p>
       <w:r>
@@ -3587,6 +4603,7 @@
         <w:t xml:space="preserve"> &lt;&lt; "Failed to create socket" &lt;&lt; </w:t>
       </w:r>
       <w:proofErr w:type="spellStart"/>
+      <w:proofErr w:type="gramStart"/>
       <w:r>
         <w:t>endl</w:t>
       </w:r>
@@ -3594,12 +4611,14 @@
       <w:r>
         <w:t>;</w:t>
       </w:r>
+      <w:proofErr w:type="gramEnd"/>
     </w:p>
     <w:p>
       <w:r>
         <w:t xml:space="preserve">        </w:t>
       </w:r>
       <w:proofErr w:type="spellStart"/>
+      <w:proofErr w:type="gramStart"/>
       <w:r>
         <w:t>WSACleanup</w:t>
       </w:r>
@@ -3607,11 +4626,17 @@
       <w:r>
         <w:t>();</w:t>
       </w:r>
-    </w:p>
-    <w:p>
-      <w:r>
-        <w:t>        return;</w:t>
-      </w:r>
+      <w:proofErr w:type="gramEnd"/>
+    </w:p>
+    <w:p>
+      <w:r>
+        <w:t xml:space="preserve">        </w:t>
+      </w:r>
+      <w:proofErr w:type="gramStart"/>
+      <w:r>
+        <w:t>return;</w:t>
+      </w:r>
+      <w:proofErr w:type="gramEnd"/>
     </w:p>
     <w:p>
       <w:r>
@@ -3642,6 +4667,7 @@
         <w:t xml:space="preserve"> </w:t>
       </w:r>
       <w:proofErr w:type="spellStart"/>
+      <w:proofErr w:type="gramStart"/>
       <w:r>
         <w:t>serverAddress</w:t>
       </w:r>
@@ -3649,6 +4675,7 @@
       <w:r>
         <w:t>;</w:t>
       </w:r>
+      <w:proofErr w:type="gramEnd"/>
     </w:p>
     <w:p>
       <w:r>
@@ -3660,8 +4687,13 @@
       </w:r>
       <w:proofErr w:type="spellEnd"/>
       <w:r>
-        <w:t xml:space="preserve"> = AF_INET;</w:t>
-      </w:r>
+        <w:t xml:space="preserve"> = AF_</w:t>
+      </w:r>
+      <w:proofErr w:type="gramStart"/>
+      <w:r>
+        <w:t>INET;</w:t>
+      </w:r>
+      <w:proofErr w:type="gramEnd"/>
     </w:p>
     <w:p>
       <w:r>
@@ -3681,8 +4713,13 @@
       </w:r>
       <w:proofErr w:type="spellEnd"/>
       <w:r>
-        <w:t>(port);</w:t>
-      </w:r>
+        <w:t>(port</w:t>
+      </w:r>
+      <w:proofErr w:type="gramStart"/>
+      <w:r>
+        <w:t>);</w:t>
+      </w:r>
+      <w:proofErr w:type="gramEnd"/>
     </w:p>
     <w:p>
       <w:r>
@@ -3690,12 +4727,25 @@
       </w:r>
       <w:proofErr w:type="spellStart"/>
       <w:r>
-        <w:t>serverAddress.sin_addr.s_addr</w:t>
-      </w:r>
-      <w:proofErr w:type="spellEnd"/>
-      <w:r>
-        <w:t xml:space="preserve"> = INADDR_ANY;</w:t>
-      </w:r>
+        <w:t>serverAddress.sin_</w:t>
+      </w:r>
+      <w:proofErr w:type="gramStart"/>
+      <w:r>
+        <w:t>addr.s</w:t>
+      </w:r>
+      <w:proofErr w:type="gramEnd"/>
+      <w:r>
+        <w:t>_addr</w:t>
+      </w:r>
+      <w:proofErr w:type="spellEnd"/>
+      <w:r>
+        <w:t xml:space="preserve"> = INADDR_</w:t>
+      </w:r>
+      <w:proofErr w:type="gramStart"/>
+      <w:r>
+        <w:t>ANY;</w:t>
+      </w:r>
+      <w:proofErr w:type="gramEnd"/>
     </w:p>
     <w:p/>
     <w:p>
@@ -3724,9 +4774,14 @@
     </w:p>
     <w:p>
       <w:r>
-        <w:t>    if (bind(</w:t>
-      </w:r>
-      <w:proofErr w:type="spellStart"/>
+        <w:t>    if (</w:t>
+      </w:r>
+      <w:proofErr w:type="gramStart"/>
+      <w:r>
+        <w:t>bind(</w:t>
+      </w:r>
+      <w:proofErr w:type="spellStart"/>
+      <w:proofErr w:type="gramEnd"/>
       <w:r>
         <w:t>listenSocket</w:t>
       </w:r>
@@ -3739,10 +4794,12 @@
         <w:t>sockaddr</w:t>
       </w:r>
       <w:proofErr w:type="spellEnd"/>
+      <w:proofErr w:type="gramStart"/>
       <w:r>
         <w:t>*)&amp;</w:t>
       </w:r>
       <w:proofErr w:type="spellStart"/>
+      <w:proofErr w:type="gramEnd"/>
       <w:r>
         <w:t>serverAddress</w:t>
       </w:r>
@@ -3780,6 +4837,7 @@
         <w:t xml:space="preserve"> &lt;&lt; "Bind failed" &lt;&lt; </w:t>
       </w:r>
       <w:proofErr w:type="spellStart"/>
+      <w:proofErr w:type="gramStart"/>
       <w:r>
         <w:t>endl</w:t>
       </w:r>
@@ -3787,6 +4845,7 @@
       <w:r>
         <w:t>;</w:t>
       </w:r>
+      <w:proofErr w:type="gramEnd"/>
     </w:p>
     <w:p>
       <w:r>
@@ -3805,15 +4864,18 @@
         <w:t>listenSocket</w:t>
       </w:r>
       <w:proofErr w:type="spellEnd"/>
+      <w:proofErr w:type="gramStart"/>
       <w:r>
         <w:t>);</w:t>
       </w:r>
+      <w:proofErr w:type="gramEnd"/>
     </w:p>
     <w:p>
       <w:r>
         <w:t xml:space="preserve">        </w:t>
       </w:r>
       <w:proofErr w:type="spellStart"/>
+      <w:proofErr w:type="gramStart"/>
       <w:r>
         <w:t>WSACleanup</w:t>
       </w:r>
@@ -3821,11 +4883,17 @@
       <w:r>
         <w:t>();</w:t>
       </w:r>
-    </w:p>
-    <w:p>
-      <w:r>
-        <w:t>        return;</w:t>
-      </w:r>
+      <w:proofErr w:type="gramEnd"/>
+    </w:p>
+    <w:p>
+      <w:r>
+        <w:t xml:space="preserve">        </w:t>
+      </w:r>
+      <w:proofErr w:type="gramStart"/>
+      <w:r>
+        <w:t>return;</w:t>
+      </w:r>
+      <w:proofErr w:type="gramEnd"/>
     </w:p>
     <w:p>
       <w:r>
@@ -3835,7 +4903,15 @@
     <w:p/>
     <w:p>
       <w:r>
-        <w:t>    //SECTION - Listen for incoming connections</w:t>
+        <w:t xml:space="preserve">    //SECTION - Listen </w:t>
+      </w:r>
+      <w:proofErr w:type="gramStart"/>
+      <w:r>
+        <w:t>for</w:t>
+      </w:r>
+      <w:proofErr w:type="gramEnd"/>
+      <w:r>
+        <w:t xml:space="preserve"> incoming connections</w:t>
       </w:r>
     </w:p>
     <w:p>
@@ -3850,9 +4926,14 @@
     </w:p>
     <w:p>
       <w:r>
-        <w:t>    if (listen(</w:t>
-      </w:r>
-      <w:proofErr w:type="spellStart"/>
+        <w:t>    if (</w:t>
+      </w:r>
+      <w:proofErr w:type="gramStart"/>
+      <w:r>
+        <w:t>listen(</w:t>
+      </w:r>
+      <w:proofErr w:type="spellStart"/>
+      <w:proofErr w:type="gramEnd"/>
       <w:r>
         <w:t>listenSocket</w:t>
       </w:r>
@@ -3874,6 +4955,7 @@
         <w:t xml:space="preserve"> &lt;&lt; "Listen failed" &lt;&lt; </w:t>
       </w:r>
       <w:proofErr w:type="spellStart"/>
+      <w:proofErr w:type="gramStart"/>
       <w:r>
         <w:t>endl</w:t>
       </w:r>
@@ -3881,6 +4963,7 @@
       <w:r>
         <w:t>;</w:t>
       </w:r>
+      <w:proofErr w:type="gramEnd"/>
     </w:p>
     <w:p>
       <w:r>
@@ -3899,15 +4982,18 @@
         <w:t>listenSocket</w:t>
       </w:r>
       <w:proofErr w:type="spellEnd"/>
+      <w:proofErr w:type="gramStart"/>
       <w:r>
         <w:t>);</w:t>
       </w:r>
+      <w:proofErr w:type="gramEnd"/>
     </w:p>
     <w:p>
       <w:r>
         <w:t xml:space="preserve">        </w:t>
       </w:r>
       <w:proofErr w:type="spellStart"/>
+      <w:proofErr w:type="gramStart"/>
       <w:r>
         <w:t>WSACleanup</w:t>
       </w:r>
@@ -3915,11 +5001,17 @@
       <w:r>
         <w:t>();</w:t>
       </w:r>
-    </w:p>
-    <w:p>
-      <w:r>
-        <w:t>        return;</w:t>
-      </w:r>
+      <w:proofErr w:type="gramEnd"/>
+    </w:p>
+    <w:p>
+      <w:r>
+        <w:t xml:space="preserve">        </w:t>
+      </w:r>
+      <w:proofErr w:type="gramStart"/>
+      <w:r>
+        <w:t>return;</w:t>
+      </w:r>
+      <w:proofErr w:type="gramEnd"/>
     </w:p>
     <w:p>
       <w:r>
@@ -3944,6 +5036,7 @@
         <w:t xml:space="preserve"> &lt;&lt; "Server listening on port " &lt;&lt; port &lt;&lt; </w:t>
       </w:r>
       <w:proofErr w:type="spellStart"/>
+      <w:proofErr w:type="gramStart"/>
       <w:r>
         <w:t>endl</w:t>
       </w:r>
@@ -3951,6 +5044,7 @@
       <w:r>
         <w:t>;</w:t>
       </w:r>
+      <w:proofErr w:type="gramEnd"/>
     </w:p>
     <w:p/>
     <w:p>
@@ -3960,7 +5054,15 @@
     </w:p>
     <w:p>
       <w:r>
-        <w:t xml:space="preserve">    // Accept incoming connections in an infinite loop. The accept function is called to wait for and accept a client connection. When a client connects, the server receives the client's address information and </w:t>
+        <w:t xml:space="preserve">    // Accept incoming connections in an infinite loop. The </w:t>
+      </w:r>
+      <w:proofErr w:type="gramStart"/>
+      <w:r>
+        <w:t>accept</w:t>
+      </w:r>
+      <w:proofErr w:type="gramEnd"/>
+      <w:r>
+        <w:t xml:space="preserve"> function is called to wait for and accept a client connection. When a client connects, the server receives the client's address information and </w:t>
       </w:r>
       <w:r>
         <w:lastRenderedPageBreak/>
@@ -3990,6 +5092,7 @@
         <w:t xml:space="preserve"> </w:t>
       </w:r>
       <w:proofErr w:type="spellStart"/>
+      <w:proofErr w:type="gramStart"/>
       <w:r>
         <w:t>clientAddress</w:t>
       </w:r>
@@ -3997,6 +5100,7 @@
       <w:r>
         <w:t>;</w:t>
       </w:r>
+      <w:proofErr w:type="gramEnd"/>
     </w:p>
     <w:p>
       <w:r>
@@ -4023,9 +5127,11 @@
         <w:t>clientAddress</w:t>
       </w:r>
       <w:proofErr w:type="spellEnd"/>
+      <w:proofErr w:type="gramStart"/>
       <w:r>
         <w:t>);</w:t>
       </w:r>
+      <w:proofErr w:type="gramEnd"/>
     </w:p>
     <w:p>
       <w:r>
@@ -4037,9 +5143,14 @@
       </w:r>
       <w:proofErr w:type="spellEnd"/>
       <w:r>
-        <w:t xml:space="preserve"> = accept(</w:t>
-      </w:r>
-      <w:proofErr w:type="spellStart"/>
+        <w:t xml:space="preserve"> = </w:t>
+      </w:r>
+      <w:proofErr w:type="gramStart"/>
+      <w:r>
+        <w:t>accept(</w:t>
+      </w:r>
+      <w:proofErr w:type="spellStart"/>
+      <w:proofErr w:type="gramEnd"/>
       <w:r>
         <w:t>listenSocket</w:t>
       </w:r>
@@ -4052,10 +5163,12 @@
         <w:t>sockaddr</w:t>
       </w:r>
       <w:proofErr w:type="spellEnd"/>
+      <w:proofErr w:type="gramStart"/>
       <w:r>
         <w:t>*)&amp;</w:t>
       </w:r>
       <w:proofErr w:type="spellStart"/>
+      <w:proofErr w:type="gramEnd"/>
       <w:r>
         <w:t>clientAddress</w:t>
       </w:r>
@@ -4068,9 +5181,11 @@
         <w:t>clientAddressSize</w:t>
       </w:r>
       <w:proofErr w:type="spellEnd"/>
+      <w:proofErr w:type="gramStart"/>
       <w:r>
         <w:t>);</w:t>
       </w:r>
+      <w:proofErr w:type="gramEnd"/>
     </w:p>
     <w:p>
       <w:r>
@@ -4103,6 +5218,7 @@
         <w:t xml:space="preserve"> &lt;&lt; "Accept failed" &lt;&lt; </w:t>
       </w:r>
       <w:proofErr w:type="spellStart"/>
+      <w:proofErr w:type="gramStart"/>
       <w:r>
         <w:t>endl</w:t>
       </w:r>
@@ -4110,11 +5226,17 @@
       <w:r>
         <w:t>;</w:t>
       </w:r>
-    </w:p>
-    <w:p>
-      <w:r>
-        <w:t>            continue;</w:t>
-      </w:r>
+      <w:proofErr w:type="gramEnd"/>
+    </w:p>
+    <w:p>
+      <w:r>
+        <w:t xml:space="preserve">            </w:t>
+      </w:r>
+      <w:proofErr w:type="gramStart"/>
+      <w:r>
+        <w:t>continue;</w:t>
+      </w:r>
+      <w:proofErr w:type="gramEnd"/>
     </w:p>
     <w:p>
       <w:r>
@@ -4139,6 +5261,7 @@
         <w:t xml:space="preserve"> &lt;&lt; "Client connected" &lt;&lt; </w:t>
       </w:r>
       <w:proofErr w:type="spellStart"/>
+      <w:proofErr w:type="gramStart"/>
       <w:r>
         <w:t>endl</w:t>
       </w:r>
@@ -4146,6 +5269,7 @@
       <w:r>
         <w:t>;</w:t>
       </w:r>
+      <w:proofErr w:type="gramEnd"/>
     </w:p>
     <w:p>
       <w:r>
@@ -4154,8 +5278,21 @@
     </w:p>
     <w:p>
       <w:r>
-        <w:t>        char buffer[1024] = {0};</w:t>
-      </w:r>
+        <w:t xml:space="preserve">        char </w:t>
+      </w:r>
+      <w:proofErr w:type="gramStart"/>
+      <w:r>
+        <w:t>buffer[</w:t>
+      </w:r>
+      <w:proofErr w:type="gramEnd"/>
+      <w:r>
+        <w:t>1024] = {0</w:t>
+      </w:r>
+      <w:proofErr w:type="gramStart"/>
+      <w:r>
+        <w:t>};</w:t>
+      </w:r>
+      <w:proofErr w:type="gramEnd"/>
     </w:p>
     <w:p>
       <w:r>
@@ -4170,6 +5307,7 @@
         <w:t xml:space="preserve"> = </w:t>
       </w:r>
       <w:proofErr w:type="spellStart"/>
+      <w:proofErr w:type="gramStart"/>
       <w:r>
         <w:t>recv</w:t>
       </w:r>
@@ -4178,13 +5316,19 @@
         <w:t>(</w:t>
       </w:r>
       <w:proofErr w:type="spellStart"/>
+      <w:proofErr w:type="gramEnd"/>
       <w:r>
         <w:t>clientSocket</w:t>
       </w:r>
       <w:proofErr w:type="spellEnd"/>
       <w:r>
-        <w:t>, buffer, 1024, 0);</w:t>
-      </w:r>
+        <w:t>, buffer, 1024, 0</w:t>
+      </w:r>
+      <w:proofErr w:type="gramStart"/>
+      <w:r>
+        <w:t>);</w:t>
+      </w:r>
+      <w:proofErr w:type="gramEnd"/>
     </w:p>
     <w:p>
       <w:r>
@@ -4201,21 +5345,36 @@
       </w:r>
       <w:proofErr w:type="spellEnd"/>
       <w:r>
-        <w:t xml:space="preserve"> &gt; 0) {</w:t>
-      </w:r>
-    </w:p>
-    <w:p>
-      <w:r>
-        <w:t xml:space="preserve">            string abbreviation(buffer, </w:t>
+        <w:t xml:space="preserve"> &gt; </w:t>
+      </w:r>
+      <w:proofErr w:type="gramStart"/>
+      <w:r>
+        <w:t>0) {</w:t>
+      </w:r>
+      <w:proofErr w:type="gramEnd"/>
+    </w:p>
+    <w:p>
+      <w:r>
+        <w:t xml:space="preserve">            string </w:t>
+      </w:r>
+      <w:proofErr w:type="gramStart"/>
+      <w:r>
+        <w:t>abbreviation(</w:t>
+      </w:r>
+      <w:proofErr w:type="gramEnd"/>
+      <w:r>
+        <w:t xml:space="preserve">buffer, </w:t>
       </w:r>
       <w:proofErr w:type="spellStart"/>
       <w:r>
         <w:t>bytesReceived</w:t>
       </w:r>
       <w:proofErr w:type="spellEnd"/>
+      <w:proofErr w:type="gramStart"/>
       <w:r>
         <w:t>);</w:t>
       </w:r>
+      <w:proofErr w:type="gramEnd"/>
     </w:p>
     <w:p>
       <w:r>
@@ -4235,6 +5394,7 @@
         <w:t xml:space="preserve"> &lt;&lt; "Received abbreviation: " &lt;&lt; abbreviation &lt;&lt; </w:t>
       </w:r>
       <w:proofErr w:type="spellStart"/>
+      <w:proofErr w:type="gramStart"/>
       <w:r>
         <w:t>endl</w:t>
       </w:r>
@@ -4242,11 +5402,17 @@
       <w:r>
         <w:t>;</w:t>
       </w:r>
-    </w:p>
-    <w:p>
-      <w:r>
-        <w:t>            string response;</w:t>
-      </w:r>
+      <w:proofErr w:type="gramEnd"/>
+    </w:p>
+    <w:p>
+      <w:r>
+        <w:t xml:space="preserve">            string </w:t>
+      </w:r>
+      <w:proofErr w:type="gramStart"/>
+      <w:r>
+        <w:t>response;</w:t>
+      </w:r>
+      <w:proofErr w:type="gramEnd"/>
     </w:p>
     <w:p>
       <w:r>
@@ -4271,15 +5437,28 @@
       </w:r>
       <w:proofErr w:type="spellEnd"/>
       <w:r>
-        <w:t xml:space="preserve">(abbreviation) != </w:t>
-      </w:r>
-      <w:proofErr w:type="spellStart"/>
+        <w:t>(abbreviation</w:t>
+      </w:r>
+      <w:proofErr w:type="gramStart"/>
+      <w:r>
+        <w:t>) !</w:t>
+      </w:r>
+      <w:proofErr w:type="gramEnd"/>
+      <w:r>
+        <w:t xml:space="preserve">= </w:t>
+      </w:r>
+      <w:proofErr w:type="spellStart"/>
+      <w:proofErr w:type="gramStart"/>
       <w:r>
         <w:t>stateMap.end</w:t>
       </w:r>
       <w:proofErr w:type="spellEnd"/>
       <w:r>
-        <w:t>()) {</w:t>
+        <w:t>(</w:t>
+      </w:r>
+      <w:proofErr w:type="gramEnd"/>
+      <w:r>
+        <w:t>)) {</w:t>
       </w:r>
     </w:p>
     <w:p>
@@ -4292,8 +5471,13 @@
       </w:r>
       <w:proofErr w:type="spellEnd"/>
       <w:r>
-        <w:t>[abbreviation];</w:t>
-      </w:r>
+        <w:t>[abbreviation</w:t>
+      </w:r>
+      <w:proofErr w:type="gramStart"/>
+      <w:r>
+        <w:t>];</w:t>
+      </w:r>
+      <w:proofErr w:type="gramEnd"/>
     </w:p>
     <w:p>
       <w:r>
@@ -4321,8 +5505,13 @@
     <w:p>
       <w:r>
         <w:lastRenderedPageBreak/>
-        <w:t>                response = "Error: Invalid state abbreviation";</w:t>
-      </w:r>
+        <w:t>                response = "Error: Invalid state abbreviation</w:t>
+      </w:r>
+      <w:proofErr w:type="gramStart"/>
+      <w:r>
+        <w:t>";</w:t>
+      </w:r>
+      <w:proofErr w:type="gramEnd"/>
     </w:p>
     <w:p>
       <w:r>
@@ -4336,9 +5525,14 @@
     </w:p>
     <w:p>
       <w:r>
-        <w:t>            send(</w:t>
-      </w:r>
-      <w:proofErr w:type="spellStart"/>
+        <w:t xml:space="preserve">            </w:t>
+      </w:r>
+      <w:proofErr w:type="gramStart"/>
+      <w:r>
+        <w:t>send(</w:t>
+      </w:r>
+      <w:proofErr w:type="spellStart"/>
+      <w:proofErr w:type="gramEnd"/>
       <w:r>
         <w:t>clientSocket</w:t>
       </w:r>
@@ -4348,20 +5542,35 @@
       </w:r>
       <w:proofErr w:type="spellStart"/>
       <w:r>
-        <w:t>response.c_str</w:t>
-      </w:r>
-      <w:proofErr w:type="spellEnd"/>
-      <w:r>
-        <w:t xml:space="preserve">(), </w:t>
-      </w:r>
-      <w:proofErr w:type="spellStart"/>
+        <w:t>response.c_</w:t>
+      </w:r>
+      <w:proofErr w:type="gramStart"/>
+      <w:r>
+        <w:t>str</w:t>
+      </w:r>
+      <w:proofErr w:type="spellEnd"/>
+      <w:r>
+        <w:t>(</w:t>
+      </w:r>
+      <w:proofErr w:type="gramEnd"/>
+      <w:r>
+        <w:t xml:space="preserve">), </w:t>
+      </w:r>
+      <w:proofErr w:type="spellStart"/>
+      <w:proofErr w:type="gramStart"/>
       <w:r>
         <w:t>response.size</w:t>
       </w:r>
       <w:proofErr w:type="spellEnd"/>
-      <w:r>
-        <w:t>(), 0);</w:t>
-      </w:r>
+      <w:proofErr w:type="gramEnd"/>
+      <w:r>
+        <w:t>(), 0</w:t>
+      </w:r>
+      <w:proofErr w:type="gramStart"/>
+      <w:r>
+        <w:t>);</w:t>
+      </w:r>
+      <w:proofErr w:type="gramEnd"/>
     </w:p>
     <w:p>
       <w:r>
@@ -4391,6 +5600,7 @@
         <w:t xml:space="preserve"> &lt;&lt; "Failed to receive data from client" &lt;&lt; </w:t>
       </w:r>
       <w:proofErr w:type="spellStart"/>
+      <w:proofErr w:type="gramStart"/>
       <w:r>
         <w:t>endl</w:t>
       </w:r>
@@ -4398,6 +5608,7 @@
       <w:r>
         <w:t>;</w:t>
       </w:r>
+      <w:proofErr w:type="gramEnd"/>
     </w:p>
     <w:p>
       <w:r>
@@ -4426,9 +5637,11 @@
         <w:t>clientSocket</w:t>
       </w:r>
       <w:proofErr w:type="spellEnd"/>
+      <w:proofErr w:type="gramStart"/>
       <w:r>
         <w:t>);</w:t>
       </w:r>
+      <w:proofErr w:type="gramEnd"/>
     </w:p>
     <w:p>
       <w:r>
@@ -4479,9 +5692,11 @@
         <w:t>listenSocket</w:t>
       </w:r>
       <w:proofErr w:type="spellEnd"/>
+      <w:proofErr w:type="gramStart"/>
       <w:r>
         <w:t>);</w:t>
       </w:r>
+      <w:proofErr w:type="gramEnd"/>
     </w:p>
     <w:p>
       <w:r>
@@ -4493,6 +5708,7 @@
         <w:t xml:space="preserve">    </w:t>
       </w:r>
       <w:proofErr w:type="spellStart"/>
+      <w:proofErr w:type="gramStart"/>
       <w:r>
         <w:t>WSACleanup</w:t>
       </w:r>
@@ -4500,6 +5716,7 @@
       <w:r>
         <w:t>();</w:t>
       </w:r>
+      <w:proofErr w:type="gramEnd"/>
     </w:p>
     <w:p>
       <w:r>
@@ -4568,7 +5785,15 @@
     <w:p/>
     <w:p>
       <w:r>
-        <w:t xml:space="preserve">//!SECTION: The Server class is declared in this header file, which includes necessary libraries and also declares the constructor and the start method. The </w:t>
+        <w:t>/</w:t>
+      </w:r>
+      <w:proofErr w:type="gramStart"/>
+      <w:r>
+        <w:t>/!SECTION</w:t>
+      </w:r>
+      <w:proofErr w:type="gramEnd"/>
+      <w:r>
+        <w:t xml:space="preserve">: The Server class is declared in this header file, which includes necessary libraries and also declares the constructor and the start method. The </w:t>
       </w:r>
       <w:proofErr w:type="spellStart"/>
       <w:r>
@@ -4596,8 +5821,13 @@
       </w:r>
     </w:p>
     <w:p>
-      <w:r>
-        <w:t>#define SERVER_H</w:t>
+      <w:proofErr w:type="gramStart"/>
+      <w:r>
+        <w:t>#define</w:t>
+      </w:r>
+      <w:proofErr w:type="gramEnd"/>
+      <w:r>
+        <w:t xml:space="preserve"> SERVER_H</w:t>
       </w:r>
     </w:p>
     <w:p/>
@@ -4617,8 +5847,13 @@
       </w:r>
     </w:p>
     <w:p>
-      <w:r>
-        <w:t>#include &lt;</w:t>
+      <w:proofErr w:type="gramStart"/>
+      <w:r>
+        <w:t>#include</w:t>
+      </w:r>
+      <w:proofErr w:type="gramEnd"/>
+      <w:r>
+        <w:t xml:space="preserve"> &lt;</w:t>
       </w:r>
       <w:proofErr w:type="spellStart"/>
       <w:r>
@@ -4630,36 +5865,66 @@
       </w:r>
     </w:p>
     <w:p>
-      <w:r>
-        <w:t>#include &lt;iostream&gt;</w:t>
-      </w:r>
-    </w:p>
-    <w:p>
-      <w:r>
-        <w:t>#include &lt;winsock2.h&gt;</w:t>
-      </w:r>
-    </w:p>
-    <w:p>
-      <w:r>
-        <w:t>#include &lt;</w:t>
-      </w:r>
-      <w:proofErr w:type="spellStart"/>
-      <w:r>
-        <w:t>windows.h</w:t>
-      </w:r>
-      <w:proofErr w:type="spellEnd"/>
+      <w:proofErr w:type="gramStart"/>
+      <w:r>
+        <w:t>#include</w:t>
+      </w:r>
+      <w:proofErr w:type="gramEnd"/>
+      <w:r>
+        <w:t xml:space="preserve"> &lt;iostream&gt;</w:t>
+      </w:r>
+    </w:p>
+    <w:p>
+      <w:proofErr w:type="gramStart"/>
+      <w:r>
+        <w:t>#include</w:t>
+      </w:r>
+      <w:proofErr w:type="gramEnd"/>
+      <w:r>
+        <w:t xml:space="preserve"> &lt;winsock2.h&gt;</w:t>
+      </w:r>
+    </w:p>
+    <w:p>
+      <w:proofErr w:type="gramStart"/>
+      <w:r>
+        <w:t>#include</w:t>
+      </w:r>
+      <w:proofErr w:type="gramEnd"/>
+      <w:r>
+        <w:t xml:space="preserve"> &lt;</w:t>
+      </w:r>
+      <w:proofErr w:type="spellStart"/>
+      <w:r>
+        <w:t>windows</w:t>
+      </w:r>
+      <w:proofErr w:type="gramStart"/>
+      <w:r>
+        <w:t>.h</w:t>
+      </w:r>
+      <w:proofErr w:type="spellEnd"/>
+      <w:proofErr w:type="gramEnd"/>
       <w:r>
         <w:t>&gt;</w:t>
       </w:r>
     </w:p>
     <w:p>
-      <w:r>
-        <w:t>#include &lt;ws2tcpip.h&gt;</w:t>
-      </w:r>
-    </w:p>
-    <w:p>
-      <w:r>
-        <w:t>#include &lt;</w:t>
+      <w:proofErr w:type="gramStart"/>
+      <w:r>
+        <w:t>#include</w:t>
+      </w:r>
+      <w:proofErr w:type="gramEnd"/>
+      <w:r>
+        <w:t xml:space="preserve"> &lt;ws2tcpip.h&gt;</w:t>
+      </w:r>
+    </w:p>
+    <w:p>
+      <w:proofErr w:type="gramStart"/>
+      <w:r>
+        <w:t>#include</w:t>
+      </w:r>
+      <w:proofErr w:type="gramEnd"/>
+      <w:r>
+        <w:t xml:space="preserve"> &lt;</w:t>
       </w:r>
       <w:proofErr w:type="spellStart"/>
       <w:r>
@@ -4671,8 +5936,13 @@
       </w:r>
     </w:p>
     <w:p>
-      <w:r>
-        <w:t>#include &lt;</w:t>
+      <w:proofErr w:type="gramStart"/>
+      <w:r>
+        <w:t>#include</w:t>
+      </w:r>
+      <w:proofErr w:type="gramEnd"/>
+      <w:r>
+        <w:t xml:space="preserve"> &lt;</w:t>
       </w:r>
       <w:proofErr w:type="spellStart"/>
       <w:r>
@@ -4685,8 +5955,13 @@
     </w:p>
     <w:p>
       <w:r>
-        <w:t>using namespace std;</w:t>
-      </w:r>
+        <w:t xml:space="preserve">using namespace </w:t>
+      </w:r>
+      <w:proofErr w:type="gramStart"/>
+      <w:r>
+        <w:t>std;</w:t>
+      </w:r>
+      <w:proofErr w:type="gramEnd"/>
     </w:p>
     <w:p/>
     <w:p>
@@ -4742,8 +6017,21 @@
     </w:p>
     <w:p>
       <w:r>
-        <w:t>    Server(int port);</w:t>
-      </w:r>
+        <w:t xml:space="preserve">    </w:t>
+      </w:r>
+      <w:proofErr w:type="gramStart"/>
+      <w:r>
+        <w:t>Server(</w:t>
+      </w:r>
+      <w:proofErr w:type="gramEnd"/>
+      <w:r>
+        <w:t>int port</w:t>
+      </w:r>
+      <w:proofErr w:type="gramStart"/>
+      <w:r>
+        <w:t>);</w:t>
+      </w:r>
+      <w:proofErr w:type="gramEnd"/>
     </w:p>
     <w:p/>
     <w:p>
@@ -4758,7 +6046,15 @@
     </w:p>
     <w:p>
       <w:r>
-        <w:t>    ~Server() {}</w:t>
+        <w:t>    ~</w:t>
+      </w:r>
+      <w:proofErr w:type="gramStart"/>
+      <w:r>
+        <w:t>Server(</w:t>
+      </w:r>
+      <w:proofErr w:type="gramEnd"/>
+      <w:r>
+        <w:t>) {}</w:t>
       </w:r>
     </w:p>
     <w:p/>
@@ -4769,7 +6065,15 @@
     </w:p>
     <w:p>
       <w:r>
-        <w:t xml:space="preserve">    // The start method is responsible for setting up the server to listen for incoming connections and handling client requests. It initializes Winsock, creates a listening socket, binds it to the specified port, and listens for incoming connections. When a client connects, it receives the state abbreviation, looks it up in the </w:t>
+        <w:t xml:space="preserve">    // The start method is responsible for setting up the server to listen </w:t>
+      </w:r>
+      <w:proofErr w:type="gramStart"/>
+      <w:r>
+        <w:t>for</w:t>
+      </w:r>
+      <w:proofErr w:type="gramEnd"/>
+      <w:r>
+        <w:t xml:space="preserve"> incoming connections and handling client requests. It initializes Winsock, creates a listening socket, binds it to the specified port, and listens for incoming connections. When a client connects, it receives the state abbreviation, looks it up in the </w:t>
       </w:r>
       <w:proofErr w:type="spellStart"/>
       <w:r>
@@ -4782,8 +6086,13 @@
     </w:p>
     <w:p>
       <w:r>
-        <w:t>    void start();</w:t>
-      </w:r>
+        <w:t xml:space="preserve">    void </w:t>
+      </w:r>
+      <w:proofErr w:type="gramStart"/>
+      <w:r>
+        <w:t>start();</w:t>
+      </w:r>
+      <w:proofErr w:type="gramEnd"/>
     </w:p>
     <w:p/>
     <w:p>
@@ -4823,8 +6132,13 @@
     </w:p>
     <w:p>
       <w:r>
-        <w:t>    int port;</w:t>
-      </w:r>
+        <w:t xml:space="preserve">    int </w:t>
+      </w:r>
+      <w:proofErr w:type="gramStart"/>
+      <w:r>
+        <w:t>port;</w:t>
+      </w:r>
+      <w:proofErr w:type="gramEnd"/>
     </w:p>
     <w:p>
       <w:r>
@@ -4844,6 +6158,7 @@
         <w:t xml:space="preserve">&lt;string, string&gt; </w:t>
       </w:r>
       <w:proofErr w:type="spellStart"/>
+      <w:proofErr w:type="gramStart"/>
       <w:r>
         <w:t>stateMap</w:t>
       </w:r>
@@ -4851,11 +6166,14 @@
       <w:r>
         <w:t>;</w:t>
       </w:r>
-    </w:p>
-    <w:p>
+      <w:proofErr w:type="gramEnd"/>
+    </w:p>
+    <w:p>
+      <w:proofErr w:type="gramStart"/>
       <w:r>
         <w:t>};</w:t>
       </w:r>
+      <w:proofErr w:type="gramEnd"/>
     </w:p>
     <w:p/>
     <w:p>
@@ -4865,7 +6183,15 @@
     </w:p>
     <w:p>
       <w:r>
-        <w:t>// The include guard is closed here to prevent multiple inclusions of this header file.</w:t>
+        <w:t xml:space="preserve">// </w:t>
+      </w:r>
+      <w:proofErr w:type="gramStart"/>
+      <w:r>
+        <w:t>The include</w:t>
+      </w:r>
+      <w:proofErr w:type="gramEnd"/>
+      <w:r>
+        <w:t xml:space="preserve"> guard is closed here to prevent multiple inclusions of this header file.</w:t>
       </w:r>
     </w:p>
     <w:p>
@@ -4912,8 +6238,166 @@
         <w:t xml:space="preserve"> work correctly for valid and invalid abbreviations.</w:t>
       </w:r>
     </w:p>
+    <w:p>
+      <w:r>
+        <w:rPr>
+          <w:noProof/>
+        </w:rPr>
+        <w:lastRenderedPageBreak/>
+        <w:drawing>
+          <wp:inline distT="0" distB="0" distL="0" distR="0" wp14:anchorId="7C635734" wp14:editId="63A25C2C">
+            <wp:extent cx="5943600" cy="3205480"/>
+            <wp:effectExtent l="0" t="0" r="0" b="0"/>
+            <wp:docPr id="1631821590" name="Picture 1"/>
+            <wp:cNvGraphicFramePr>
+              <a:graphicFrameLocks xmlns:a="http://schemas.openxmlformats.org/drawingml/2006/main" noChangeAspect="1"/>
+            </wp:cNvGraphicFramePr>
+            <a:graphic xmlns:a="http://schemas.openxmlformats.org/drawingml/2006/main">
+              <a:graphicData uri="http://schemas.openxmlformats.org/drawingml/2006/picture">
+                <pic:pic xmlns:pic="http://schemas.openxmlformats.org/drawingml/2006/picture">
+                  <pic:nvPicPr>
+                    <pic:cNvPr id="1631821590" name="Picture 1631821590"/>
+                    <pic:cNvPicPr/>
+                  </pic:nvPicPr>
+                  <pic:blipFill>
+                    <a:blip r:embed="rId13" cstate="print">
+                      <a:extLst>
+                        <a:ext uri="{28A0092B-C50C-407E-A947-70E740481C1C}">
+                          <a14:useLocalDpi xmlns:a14="http://schemas.microsoft.com/office/drawing/2010/main" val="0"/>
+                        </a:ext>
+                      </a:extLst>
+                    </a:blip>
+                    <a:stretch>
+                      <a:fillRect/>
+                    </a:stretch>
+                  </pic:blipFill>
+                  <pic:spPr>
+                    <a:xfrm>
+                      <a:off x="0" y="0"/>
+                      <a:ext cx="5943600" cy="3205480"/>
+                    </a:xfrm>
+                    <a:prstGeom prst="rect">
+                      <a:avLst/>
+                    </a:prstGeom>
+                  </pic:spPr>
+                </pic:pic>
+              </a:graphicData>
+            </a:graphic>
+          </wp:inline>
+        </w:drawing>
+      </w:r>
+    </w:p>
+    <w:p>
+      <w:r>
+        <w:rPr>
+          <w:noProof/>
+        </w:rPr>
+        <w:drawing>
+          <wp:inline distT="0" distB="0" distL="0" distR="0" wp14:anchorId="20FE6CEA" wp14:editId="0F0F93B6">
+            <wp:extent cx="5943600" cy="3202305"/>
+            <wp:effectExtent l="0" t="0" r="0" b="0"/>
+            <wp:docPr id="2099695217" name="Picture 2"/>
+            <wp:cNvGraphicFramePr>
+              <a:graphicFrameLocks xmlns:a="http://schemas.openxmlformats.org/drawingml/2006/main" noChangeAspect="1"/>
+            </wp:cNvGraphicFramePr>
+            <a:graphic xmlns:a="http://schemas.openxmlformats.org/drawingml/2006/main">
+              <a:graphicData uri="http://schemas.openxmlformats.org/drawingml/2006/picture">
+                <pic:pic xmlns:pic="http://schemas.openxmlformats.org/drawingml/2006/picture">
+                  <pic:nvPicPr>
+                    <pic:cNvPr id="2099695217" name="Picture 2099695217"/>
+                    <pic:cNvPicPr/>
+                  </pic:nvPicPr>
+                  <pic:blipFill>
+                    <a:blip r:embed="rId14" cstate="print">
+                      <a:extLst>
+                        <a:ext uri="{28A0092B-C50C-407E-A947-70E740481C1C}">
+                          <a14:useLocalDpi xmlns:a14="http://schemas.microsoft.com/office/drawing/2010/main" val="0"/>
+                        </a:ext>
+                      </a:extLst>
+                    </a:blip>
+                    <a:stretch>
+                      <a:fillRect/>
+                    </a:stretch>
+                  </pic:blipFill>
+                  <pic:spPr>
+                    <a:xfrm>
+                      <a:off x="0" y="0"/>
+                      <a:ext cx="5943600" cy="3202305"/>
+                    </a:xfrm>
+                    <a:prstGeom prst="rect">
+                      <a:avLst/>
+                    </a:prstGeom>
+                  </pic:spPr>
+                </pic:pic>
+              </a:graphicData>
+            </a:graphic>
+          </wp:inline>
+        </w:drawing>
+      </w:r>
+    </w:p>
+    <w:p>
+      <w:r>
+        <w:rPr>
+          <w:noProof/>
+        </w:rPr>
+        <w:lastRenderedPageBreak/>
+        <w:drawing>
+          <wp:inline distT="0" distB="0" distL="0" distR="0" wp14:anchorId="061EB3C2" wp14:editId="155F9624">
+            <wp:extent cx="5943600" cy="3204210"/>
+            <wp:effectExtent l="0" t="0" r="0" b="0"/>
+            <wp:docPr id="1643744337" name="Picture 3"/>
+            <wp:cNvGraphicFramePr>
+              <a:graphicFrameLocks xmlns:a="http://schemas.openxmlformats.org/drawingml/2006/main" noChangeAspect="1"/>
+            </wp:cNvGraphicFramePr>
+            <a:graphic xmlns:a="http://schemas.openxmlformats.org/drawingml/2006/main">
+              <a:graphicData uri="http://schemas.openxmlformats.org/drawingml/2006/picture">
+                <pic:pic xmlns:pic="http://schemas.openxmlformats.org/drawingml/2006/picture">
+                  <pic:nvPicPr>
+                    <pic:cNvPr id="1643744337" name="Picture 1643744337"/>
+                    <pic:cNvPicPr/>
+                  </pic:nvPicPr>
+                  <pic:blipFill>
+                    <a:blip r:embed="rId15" cstate="print">
+                      <a:extLst>
+                        <a:ext uri="{28A0092B-C50C-407E-A947-70E740481C1C}">
+                          <a14:useLocalDpi xmlns:a14="http://schemas.microsoft.com/office/drawing/2010/main" val="0"/>
+                        </a:ext>
+                      </a:extLst>
+                    </a:blip>
+                    <a:stretch>
+                      <a:fillRect/>
+                    </a:stretch>
+                  </pic:blipFill>
+                  <pic:spPr>
+                    <a:xfrm>
+                      <a:off x="0" y="0"/>
+                      <a:ext cx="5943600" cy="3204210"/>
+                    </a:xfrm>
+                    <a:prstGeom prst="rect">
+                      <a:avLst/>
+                    </a:prstGeom>
+                  </pic:spPr>
+                </pic:pic>
+              </a:graphicData>
+            </a:graphic>
+          </wp:inline>
+        </w:drawing>
+      </w:r>
+    </w:p>
+    <w:p/>
+    <w:p>
+      <w:hyperlink r:id="rId16" w:history="1">
+        <w:r>
+          <w:rPr>
+            <w:rStyle w:val="Hyperlink"/>
+          </w:rPr>
+          <w:t>Module-6-Client-Server-Test.mp4</w:t>
+        </w:r>
+      </w:hyperlink>
+    </w:p>
+    <w:p/>
     <w:sectPr>
-      <w:headerReference w:type="default" r:id="rId12"/>
+      <w:headerReference w:type="default" r:id="rId17"/>
       <w:pgSz w:w="12240" w:h="15840"/>
       <w:pgMar w:top="1440" w:right="1440" w:bottom="1440" w:left="1440" w:header="720" w:footer="720" w:gutter="0"/>
       <w:cols w:space="720"/>
@@ -4995,7 +6479,15 @@
       <w:t xml:space="preserve">Due Date: </w:t>
     </w:r>
     <w:r>
-      <w:t>Sun Mar 1, 2026 12:59am</w:t>
+      <w:t xml:space="preserve">Sun Mar 1, </w:t>
+    </w:r>
+    <w:proofErr w:type="gramStart"/>
+    <w:r>
+      <w:t>2026</w:t>
+    </w:r>
+    <w:proofErr w:type="gramEnd"/>
+    <w:r>
+      <w:t xml:space="preserve"> 12:59am</w:t>
     </w:r>
   </w:p>
 </w:hdr>

</xml_diff>